<commit_message>
fix: correct figure refs, table captions, repo URL and DNS restore steps per validation
</commit_message>
<xml_diff>
--- a/report/PR5_SSH_UFW_DNS_Report.docx
+++ b/report/PR5_SSH_UFW_DNS_Report.docx
@@ -240,7 +240,7 @@
           <w:b w:val="0"/>
           <w:i w:val="0"/>
         </w:rPr>
-        <w:t>Для достижения цели решались пять задач: развернуть Ubuntu Server 24.04 в VirtualBox и настроить связность «хост — гость»; разобраться в модели доверия SSH (ключи хоста, known_hosts, authorized_keys); выполнить hardening sshd без потери управления; настроить UFW по принципу «запрещено всё, кроме явно разрешённого»; сопоставить серверу имя devops.local и понять порядок разрешения имён в Linux.</w:t>
+        <w:t>Для достижения цели делал по шагам: развернуть Ubuntu Server 24.04 в VirtualBox и настроить связность «хост — гость»; разобраться в модели доверия SSH (ключи хоста, known_hosts, authorized_keys); выполнить hardening sshd без потери управления; настроить UFW по принципу «запрещено всё, кроме явно разрешённого»; сопоставить серверу имя devops.local и понять порядок разрешения имён в Linux.</w:t>
       </w:r>
     </w:p>
     <w:p>
@@ -284,6 +284,18 @@
       </w:pPr>
       <w:r>
         <w:t>1.1 Параметры машины и сети</w:t>
+      </w:r>
+    </w:p>
+    <w:p>
+      <w:pPr>
+        <w:spacing w:after="80" w:before="240"/>
+        <w:ind w:firstLine="0"/>
+      </w:pPr>
+      <w:r>
+        <w:rPr>
+          <w:sz w:val="24"/>
+        </w:rPr>
+        <w:t>Таблица 1 – Параметры виртуальной машины devops-vm</w:t>
       </w:r>
     </w:p>
     <w:tbl>
@@ -857,7 +869,7 @@
           <w:b w:val="0"/>
           <w:i w:val="0"/>
         </w:rPr>
-        <w:t>Идея задания — уйти от общего пользователя student к персональному devops с входом по ключу. Отдельный ключ именно под эту ВМ я сделал осознанно: ключ от репозиториев (работа № 1) сюда тащить нельзя, иначе компрометация учебного сервера потянет за собой и доступ к коду. Разделение ключевого материала — базовый принцип.</w:t>
+        <w:t>Идея задания — уйти от общего пользователя student к персональному devops с входом по ключу. Отдельный ключ именно под эту ВМ я сделал осознанно: не хотел тащить сюда ключ от репозиториев из работы № 1 — если уведут ключ с учебного стенда, за ним потянется и доступ к коду.</w:t>
       </w:r>
     </w:p>
     <w:p>
@@ -2567,7 +2579,7 @@
           <w:b w:val="0"/>
           <w:i w:val="0"/>
         </w:rPr>
-        <w:t>К работе № 6 повторил три темы. Nginx — легковесный веб-сервер и обратный прокси: отдаёт статику, балансирует, терминирует TLS; базовая конфигурация — server-блоки в sites-available. Прямой (forward) прокси стоит возле клиента и ходит в Интернет за него (пример — корпоративный прокси с фильтрацией), обратный (reverse) стоит перед серверами и принимает запросы за них (пример — Nginx перед приложением). TLS: сервер предъявляет сертификат, клиент проверяет цепочку до доверенного УЦ и имя хоста; у самоподписанного сертификата цепочки нет, поэтому браузер ругается — он не может отличить такой сертификат от подделки.</w:t>
+        <w:t>К работе № 6 повторил три темы по документации Ubuntu Server и паре статей с Хабра. Nginx — легковесный веб-сервер и обратный прокси: отдаёт статику, балансирует, терминирует TLS; база — server-блоки в sites-available. С прокси разница такая: прямой (forward) стоит возле клиента и ходит в Интернет за него — пример корпоративный фильтр; обратный (reverse) стоит перед серверами и принимает запросы за них — пример Nginx перед приложением. Про TLS главное: сервер предъявляет сертификат, клиент проверяет цепочку до доверенного УЦ и имя хоста. У самоподписанного цепочки нет, поэтому браузер и предупреждает — отличить его от подделки он не может.</w:t>
       </w:r>
     </w:p>
     <w:p>
@@ -2593,7 +2605,7 @@
           <w:b w:val="0"/>
           <w:i w:val="0"/>
         </w:rPr>
-        <w:t>Проверял двумя прогонами. На корректной конфигурации — все шесть проверок зелёные, код 0 (рисунок 12). Затем временно поставил MaxAuthTries 10 и перезапустил sshd — скрипт честно упал с FAIL по этой проверке и кодом 1 (рисунок 13). После вернул 3 обратно и перезапустил службу.</w:t>
+        <w:t>Проверял двумя прогонами. На корректной конфигурации — все шесть проверок зелёные, код 0 (рисунок 12). Затем временно поставил MaxAuthTries 10 и перезапустил sshd — скрипт честно упал с FAIL по этой проверке и кодом 1 (рисунок 14). После вернул 3 обратно и перезапустил службу.</w:t>
       </w:r>
     </w:p>
     <w:p>
@@ -2919,6 +2931,27 @@
       </w:pPr>
       <w:r>
         <w:t>9 Контроль перед сдачей (таблица 7)</w:t>
+      </w:r>
+    </w:p>
+    <w:p>
+      <w:r>
+        <w:rPr>
+          <w:b w:val="0"/>
+          <w:i w:val="0"/>
+        </w:rPr>
+        <w:t>Итоговую сверку по таблице 7 методических указаний свёл в таблицу 2: каждая строка подтверждается скриншотом или командой из текста выше.</w:t>
+      </w:r>
+    </w:p>
+    <w:p>
+      <w:pPr>
+        <w:spacing w:after="80" w:before="240"/>
+        <w:ind w:firstLine="0"/>
+      </w:pPr>
+      <w:r>
+        <w:rPr>
+          <w:sz w:val="24"/>
+        </w:rPr>
+        <w:t>Таблица 2 – Контроль выполнения условий перед сдачей отчёта</w:t>
       </w:r>
     </w:p>
     <w:tbl>
@@ -3497,7 +3530,7 @@
           <w:b w:val="0"/>
           <w:i w:val="0"/>
         </w:rPr>
-        <w:t>Работа выполнена полностью: машина поднята, вход по ключу настроен, SSH ужесточён (порт 2222, без root и паролей, лимиты и таймауты), фаервол работает по принципу deny-by-default с rate-limit, имя devops.local резолвится, скрипт и документация лежат в репозитории. Три снимка состояния созданы и проверены.</w:t>
+        <w:t>Главное для меня: машина не просто поднялась, а пережила hardening без потери доступа — SSH только по ключу на порту 2222, без root и паролей, с лимитами и таймаутами. Фаервол работает по deny-by-default с rate-limit, имя devops.local резолвится, скрипт и документация лежат в репозитории. Три снимка состояния созданы и проверены.</w:t>
       </w:r>
     </w:p>
     <w:p>
@@ -3642,7 +3675,7 @@
           <w:b w:val="0"/>
           <w:i w:val="0"/>
         </w:rPr>
-        <w:t>Репозиторий: devops-course-2026. Файлы работы № 5: scripts/audit.sh (скрипт контроля с тремя реализованными проверками), docs/server-setup.md (восстановление за 10 минут), report/PR5_SSH_UFW_DNS_Report.docx (данный отчёт), report/screenshots/ (копии экрана). Коммиты оформлены по Conventional Commits.</w:t>
+        <w:t>Репозиторий: devops-course-2026 — https://github.com/ddlyapunov/devops-course-2026. Файлы работы № 5: scripts/audit.sh (скрипт контроля с тремя реализованными проверками), docs/server-setup.md (восстановление за 10 минут), report/PR5_SSH_UFW_DNS_Report.docx (данный отчёт), report/screenshots/ (копии экрана). Коммиты оформлены по Conventional Commits.</w:t>
       </w:r>
     </w:p>
     <w:p>

</xml_diff>

<commit_message>
docs: remove table of contents from PR5 report, keep title placeholder
</commit_message>
<xml_diff>
--- a/report/PR5_SSH_UFW_DNS_Report.docx
+++ b/report/PR5_SSH_UFW_DNS_Report.docx
@@ -41,175 +41,6 @@
           <w:sz w:val="24"/>
         </w:rPr>
         <w:t>Служебная информация: отчёт подготовлен по методическим указаниям DEV_5.md от 26.09.2026. Репозиторий: devops-course-2026 (scripts/audit.sh, docs/server-setup.md).</w:t>
-      </w:r>
-    </w:p>
-    <w:p>
-      <w:r>
-        <w:br w:type="page"/>
-      </w:r>
-    </w:p>
-    <w:p>
-      <w:pPr>
-        <w:pStyle w:val="Heading1"/>
-      </w:pPr>
-      <w:r>
-        <w:t>Содержание</w:t>
-      </w:r>
-    </w:p>
-    <w:p>
-      <w:pPr>
-        <w:spacing w:after="40"/>
-        <w:ind w:firstLine="0"/>
-      </w:pPr>
-      <w:r>
-        <w:rPr>
-          <w:sz w:val="26"/>
-        </w:rPr>
-        <w:t>Введение (цель и задачи работы)</w:t>
-      </w:r>
-    </w:p>
-    <w:p>
-      <w:pPr>
-        <w:spacing w:after="40"/>
-        <w:ind w:firstLine="0"/>
-      </w:pPr>
-      <w:r>
-        <w:rPr>
-          <w:sz w:val="26"/>
-        </w:rPr>
-        <w:t>1 Подготовка к занятию: виртуальная машина</w:t>
-      </w:r>
-    </w:p>
-    <w:p>
-      <w:pPr>
-        <w:spacing w:after="40"/>
-        <w:ind w:firstLine="0"/>
-      </w:pPr>
-      <w:r>
-        <w:rPr>
-          <w:sz w:val="26"/>
-        </w:rPr>
-        <w:t>2 Задание 1. Учётная запись и ключевая аутентификация</w:t>
-      </w:r>
-    </w:p>
-    <w:p>
-      <w:pPr>
-        <w:spacing w:after="40"/>
-        <w:ind w:firstLine="0"/>
-      </w:pPr>
-      <w:r>
-        <w:rPr>
-          <w:sz w:val="26"/>
-        </w:rPr>
-        <w:t>3 Задание 2. Усиление защиты службы SSH</w:t>
-      </w:r>
-    </w:p>
-    <w:p>
-      <w:pPr>
-        <w:spacing w:after="40"/>
-        <w:ind w:firstLine="0"/>
-      </w:pPr>
-      <w:r>
-        <w:rPr>
-          <w:sz w:val="26"/>
-        </w:rPr>
-        <w:t>4 Задание 3. Межсетевой экран UFW</w:t>
-      </w:r>
-    </w:p>
-    <w:p>
-      <w:pPr>
-        <w:spacing w:after="40"/>
-        <w:ind w:firstLine="0"/>
-      </w:pPr>
-      <w:r>
-        <w:rPr>
-          <w:sz w:val="26"/>
-        </w:rPr>
-        <w:t>5 Задание 4. Локальное доменное имя</w:t>
-      </w:r>
-    </w:p>
-    <w:p>
-      <w:pPr>
-        <w:spacing w:after="40"/>
-        <w:ind w:firstLine="0"/>
-      </w:pPr>
-      <w:r>
-        <w:rPr>
-          <w:sz w:val="26"/>
-        </w:rPr>
-        <w:t>6 Факультативное задание. SSH-туннель</w:t>
-      </w:r>
-    </w:p>
-    <w:p>
-      <w:pPr>
-        <w:spacing w:after="40"/>
-        <w:ind w:firstLine="0"/>
-      </w:pPr>
-      <w:r>
-        <w:rPr>
-          <w:sz w:val="26"/>
-        </w:rPr>
-        <w:t>7 Самостоятельная работа: audit.sh и server-setup.md</w:t>
-      </w:r>
-    </w:p>
-    <w:p>
-      <w:pPr>
-        <w:spacing w:after="40"/>
-        <w:ind w:firstLine="0"/>
-      </w:pPr>
-      <w:r>
-        <w:rPr>
-          <w:sz w:val="26"/>
-        </w:rPr>
-        <w:t>8 Ответы на контрольные вопросы</w:t>
-      </w:r>
-    </w:p>
-    <w:p>
-      <w:pPr>
-        <w:spacing w:after="40"/>
-        <w:ind w:firstLine="0"/>
-      </w:pPr>
-      <w:r>
-        <w:rPr>
-          <w:sz w:val="26"/>
-        </w:rPr>
-        <w:t>9 Контроль перед сдачей (таблица 7)</w:t>
-      </w:r>
-    </w:p>
-    <w:p>
-      <w:pPr>
-        <w:spacing w:after="40"/>
-        <w:ind w:firstLine="0"/>
-      </w:pPr>
-      <w:r>
-        <w:rPr>
-          <w:sz w:val="26"/>
-        </w:rPr>
-        <w:t>Заключение</w:t>
-      </w:r>
-    </w:p>
-    <w:p>
-      <w:pPr>
-        <w:spacing w:after="40"/>
-        <w:ind w:firstLine="0"/>
-      </w:pPr>
-      <w:r>
-        <w:rPr>
-          <w:sz w:val="26"/>
-        </w:rPr>
-        <w:t>Список использованных источников</w:t>
-      </w:r>
-    </w:p>
-    <w:p>
-      <w:pPr>
-        <w:spacing w:after="40"/>
-        <w:ind w:firstLine="0"/>
-      </w:pPr>
-      <w:r>
-        <w:rPr>
-          <w:sz w:val="26"/>
-        </w:rPr>
-        <w:t>Приложение А. Ссылка на репозиторий</w:t>
       </w:r>
     </w:p>
     <w:p>

</xml_diff>

<commit_message>
docs: insert MIREA title page with gerb into PR5 report, margins 30/15, table widths
</commit_message>
<xml_diff>
--- a/report/PR5_SSH_UFW_DNS_Report.docx
+++ b/report/PR5_SSH_UFW_DNS_Report.docx
@@ -4,43 +4,595 @@
   <w:body>
     <w:p>
       <w:pPr>
+        <w:spacing w:before="0" w:after="120"/>
         <w:ind w:firstLine="0"/>
         <w:jc w:val="center"/>
       </w:pPr>
       <w:r>
+        <w:drawing>
+          <wp:inline xmlns:a="http://schemas.openxmlformats.org/drawingml/2006/main" xmlns:pic="http://schemas.openxmlformats.org/drawingml/2006/picture">
+            <wp:extent cx="990000" cy="1122552"/>
+            <wp:docPr id="1" name="Picture 1"/>
+            <wp:cNvGraphicFramePr>
+              <a:graphicFrameLocks noChangeAspect="1"/>
+            </wp:cNvGraphicFramePr>
+            <a:graphic>
+              <a:graphicData uri="http://schemas.openxmlformats.org/drawingml/2006/picture">
+                <pic:pic>
+                  <pic:nvPicPr>
+                    <pic:cNvPr id="0" name="title_gerb.jpg"/>
+                    <pic:cNvPicPr/>
+                  </pic:nvPicPr>
+                  <pic:blipFill>
+                    <a:blip r:embed="rId10"/>
+                    <a:stretch>
+                      <a:fillRect/>
+                    </a:stretch>
+                  </pic:blipFill>
+                  <pic:spPr>
+                    <a:xfrm>
+                      <a:off x="0" y="0"/>
+                      <a:ext cx="990000" cy="1122552"/>
+                    </a:xfrm>
+                    <a:prstGeom prst="rect"/>
+                  </pic:spPr>
+                </pic:pic>
+              </a:graphicData>
+            </a:graphic>
+          </wp:inline>
+        </w:drawing>
+      </w:r>
+    </w:p>
+    <w:tbl>
+      <w:tblPr>
+        <w:tblW w:type="auto" w:w="0"/>
+        <w:jc w:val="center"/>
+        <w:tblLayout w:type="autofit"/>
+        <w:tblLook w:firstColumn="1" w:firstRow="1" w:lastColumn="0" w:lastRow="0" w:noHBand="0" w:noVBand="1" w:val="04A0"/>
+        <w:tblBorders>
+          <w:top w:val="nil" w:sz="0" w:space="0" w:color="auto"/>
+          <w:left w:val="nil" w:sz="0" w:space="0" w:color="auto"/>
+          <w:bottom w:val="nil" w:sz="0" w:space="0" w:color="auto"/>
+          <w:right w:val="nil" w:sz="0" w:space="0" w:color="auto"/>
+          <w:insideH w:val="nil" w:sz="0" w:space="0" w:color="auto"/>
+          <w:insideV w:val="nil" w:sz="0" w:space="0" w:color="auto"/>
+        </w:tblBorders>
+      </w:tblPr>
+      <w:tblGrid>
+        <w:gridCol w:w="9355"/>
+      </w:tblGrid>
+      <w:tr>
+        <w:tc>
+          <w:tcPr>
+            <w:tcW w:type="dxa" w:w="9355"/>
+          </w:tcPr>
+          <w:p>
+            <w:pPr>
+              <w:spacing w:before="0" w:after="0"/>
+              <w:ind w:firstLine="0"/>
+              <w:jc w:val="center"/>
+            </w:pPr>
+            <w:r/>
+            <w:r>
+              <w:rPr>
+                <w:rFonts w:ascii="Times New Roman" w:hAnsi="Times New Roman"/>
+                <w:b w:val="0"/>
+                <w:color w:val="000000"/>
+                <w:sz w:val="28"/>
+              </w:rPr>
+              <w:t>МИНОБРНАУКИ РОССИИ</w:t>
+            </w:r>
+          </w:p>
+        </w:tc>
+      </w:tr>
+      <w:tr>
+        <w:tc>
+          <w:tcPr>
+            <w:tcW w:type="dxa" w:w="9355"/>
+          </w:tcPr>
+          <w:p>
+            <w:pPr>
+              <w:spacing w:before="0" w:after="0"/>
+              <w:ind w:firstLine="0"/>
+              <w:jc w:val="center"/>
+            </w:pPr>
+            <w:r/>
+            <w:r>
+              <w:rPr>
+                <w:rFonts w:ascii="Times New Roman" w:hAnsi="Times New Roman"/>
+                <w:b w:val="0"/>
+                <w:color w:val="000000"/>
+                <w:sz w:val="28"/>
+              </w:rPr>
+              <w:t>Федеральное государственное бюджетное образовательное учреждение</w:t>
+            </w:r>
+          </w:p>
+          <w:p>
+            <w:pPr>
+              <w:spacing w:before="0" w:after="0"/>
+              <w:ind w:firstLine="0"/>
+              <w:jc w:val="center"/>
+            </w:pPr>
+            <w:r>
+              <w:rPr>
+                <w:rFonts w:ascii="Times New Roman" w:hAnsi="Times New Roman"/>
+                <w:b w:val="0"/>
+                <w:color w:val="000000"/>
+                <w:sz w:val="28"/>
+              </w:rPr>
+              <w:t>высшего образования</w:t>
+            </w:r>
+          </w:p>
+          <w:p>
+            <w:pPr>
+              <w:spacing w:before="0" w:after="0"/>
+              <w:ind w:firstLine="0"/>
+              <w:jc w:val="center"/>
+            </w:pPr>
+            <w:r>
+              <w:rPr>
+                <w:rFonts w:ascii="Times New Roman" w:hAnsi="Times New Roman"/>
+                <w:b w:val="0"/>
+                <w:color w:val="000000"/>
+                <w:sz w:val="28"/>
+              </w:rPr>
+              <w:t>«МИРЭА – Российский технологический университет»</w:t>
+            </w:r>
+          </w:p>
+          <w:p>
+            <w:pPr>
+              <w:spacing w:before="0" w:after="0"/>
+              <w:ind w:firstLine="0"/>
+              <w:jc w:val="center"/>
+            </w:pPr>
+            <w:r>
+              <w:rPr>
+                <w:rFonts w:ascii="Times New Roman" w:hAnsi="Times New Roman"/>
+                <w:b w:val="0"/>
+                <w:color w:val="000000"/>
+                <w:sz w:val="28"/>
+              </w:rPr>
+              <w:t>РТУ МИРЭА</w:t>
+            </w:r>
+          </w:p>
+        </w:tc>
+      </w:tr>
+    </w:tbl>
+    <w:p>
+      <w:pPr>
+        <w:spacing w:before="0" w:after="0"/>
+        <w:ind w:firstLine="0"/>
+      </w:pPr>
+    </w:p>
+    <w:p>
+      <w:pPr>
+        <w:spacing w:before="0" w:after="0"/>
+        <w:ind w:firstLine="0"/>
+      </w:pPr>
+    </w:p>
+    <w:p>
+      <w:pPr>
+        <w:spacing w:before="0" w:after="0" w:line="240" w:lineRule="auto"/>
+        <w:ind w:firstLine="0"/>
+        <w:jc w:val="center"/>
+      </w:pPr>
+      <w:r>
         <w:rPr>
+          <w:rFonts w:ascii="Times New Roman" w:hAnsi="Times New Roman"/>
           <w:b/>
-          <w:i w:val="0"/>
+          <w:color w:val="000000"/>
           <w:sz w:val="32"/>
         </w:rPr>
-        <w:t>МЕСТО ДЛЯ ТИТУЛЬНОГО ЛИСТА</w:t>
+        <w:t>Практическое занятие № 5</w:t>
       </w:r>
     </w:p>
     <w:p>
       <w:pPr>
+        <w:spacing w:before="0" w:after="0" w:line="240" w:lineRule="auto"/>
         <w:ind w:firstLine="0"/>
-        <w:jc w:val="both"/>
+        <w:jc w:val="center"/>
       </w:pPr>
       <w:r>
         <w:rPr>
-          <w:b w:val="0"/>
-          <w:i w:val="0"/>
-          <w:sz w:val="24"/>
+          <w:rFonts w:ascii="Times New Roman" w:hAnsi="Times New Roman"/>
+          <w:color w:val="000000"/>
+          <w:sz w:val="32"/>
         </w:rPr>
-        <w:t>Титульный лист вставляется сюда перед печатью / сдачей. Данный лист-заглушка при оформлении заменяется титульным листом вуза (ИПТИП, кафедра Индустриального программирования, дисциплина «Инструменты девопс», практическая работа № 5, студент Ляпунов Д. Д., группа ЭФБО-04-24, преподаватель Гиматдинов Д. М., 2026/2027). Нумерация страниц начинается со следующего листа.</w:t>
+        <w:t>по дисциплине «Инструменты девопс»</w:t>
       </w:r>
     </w:p>
     <w:p>
       <w:pPr>
         <w:ind w:firstLine="0"/>
       </w:pPr>
+    </w:p>
+    <w:p>
+      <w:pPr>
+        <w:spacing w:before="0" w:after="0" w:line="360" w:lineRule="auto"/>
+        <w:ind w:firstLine="0"/>
+      </w:pPr>
       <w:r>
         <w:rPr>
+          <w:rFonts w:ascii="Times New Roman" w:hAnsi="Times New Roman"/>
+          <w:b/>
+          <w:color w:val="000000"/>
+          <w:sz w:val="28"/>
+        </w:rPr>
+        <w:t>Тема работы: Удалённый сервер и безопасный доступ. SSH, sudo, UFW, DNS</w:t>
+      </w:r>
+    </w:p>
+    <w:p>
+      <w:pPr>
+        <w:spacing w:before="0" w:after="0"/>
+        <w:ind w:firstLine="0"/>
+      </w:pPr>
+    </w:p>
+    <w:p>
+      <w:pPr>
+        <w:spacing w:before="0" w:after="0"/>
+        <w:ind w:firstLine="0"/>
+      </w:pPr>
+    </w:p>
+    <w:tbl>
+      <w:tblPr>
+        <w:tblW w:type="auto" w:w="0"/>
+        <w:jc w:val="center"/>
+        <w:tblLayout w:type="fixed"/>
+        <w:tblLook w:firstColumn="1" w:firstRow="1" w:lastColumn="0" w:lastRow="0" w:noHBand="0" w:noVBand="1" w:val="04A0"/>
+        <w:tblBorders>
+          <w:top w:val="nil" w:sz="0" w:space="0" w:color="auto"/>
+          <w:left w:val="nil" w:sz="0" w:space="0" w:color="auto"/>
+          <w:bottom w:val="nil" w:sz="0" w:space="0" w:color="auto"/>
+          <w:right w:val="nil" w:sz="0" w:space="0" w:color="auto"/>
+          <w:insideH w:val="nil" w:sz="0" w:space="0" w:color="auto"/>
+          <w:insideV w:val="nil" w:sz="0" w:space="0" w:color="auto"/>
+        </w:tblBorders>
+      </w:tblPr>
+      <w:tblGrid>
+        <w:gridCol w:w="2339"/>
+        <w:gridCol w:w="2339"/>
+        <w:gridCol w:w="2339"/>
+        <w:gridCol w:w="2339"/>
+      </w:tblGrid>
+      <w:tr>
+        <w:tc>
+          <w:tcPr>
+            <w:tcW w:type="dxa" w:w="1474"/>
+          </w:tcPr>
+          <w:p>
+            <w:pPr>
+              <w:spacing w:before="0" w:after="0"/>
+              <w:ind w:firstLine="0"/>
+              <w:jc w:val="center"/>
+            </w:pPr>
+            <w:r/>
+            <w:r>
+              <w:rPr>
+                <w:rFonts w:ascii="Times New Roman" w:hAnsi="Times New Roman"/>
+                <w:b w:val="0"/>
+                <w:color w:val="000000"/>
+                <w:sz w:val="28"/>
+              </w:rPr>
+              <w:t>Выполнил:</w:t>
+            </w:r>
+          </w:p>
+        </w:tc>
+        <w:tc>
+          <w:tcPr>
+            <w:tcW w:type="dxa" w:w="3061"/>
+          </w:tcPr>
+          <w:p>
+            <w:pPr>
+              <w:spacing w:before="0" w:after="0"/>
+              <w:ind w:firstLine="0"/>
+              <w:jc w:val="center"/>
+            </w:pPr>
+            <w:r/>
+            <w:r>
+              <w:rPr>
+                <w:rFonts w:ascii="Times New Roman" w:hAnsi="Times New Roman"/>
+                <w:b w:val="0"/>
+                <w:color w:val="000000"/>
+                <w:sz w:val="28"/>
+              </w:rPr>
+              <w:t>студент группы</w:t>
+            </w:r>
+          </w:p>
+        </w:tc>
+        <w:tc>
+          <w:tcPr>
+            <w:tcW w:type="dxa" w:w="1701"/>
+          </w:tcPr>
+          <w:p>
+            <w:pPr>
+              <w:spacing w:before="0" w:after="0"/>
+              <w:ind w:firstLine="0"/>
+              <w:jc w:val="center"/>
+            </w:pPr>
+            <w:r/>
+            <w:r>
+              <w:rPr>
+                <w:rFonts w:ascii="Times New Roman" w:hAnsi="Times New Roman"/>
+                <w:b w:val="0"/>
+                <w:color w:val="000000"/>
+                <w:sz w:val="24"/>
+              </w:rPr>
+              <w:t>(подпись)</w:t>
+            </w:r>
+          </w:p>
+        </w:tc>
+        <w:tc>
+          <w:tcPr>
+            <w:tcW w:type="dxa" w:w="3118"/>
+          </w:tcPr>
+          <w:p>
+            <w:pPr>
+              <w:spacing w:before="0" w:after="0"/>
+              <w:ind w:firstLine="0"/>
+              <w:jc w:val="center"/>
+            </w:pPr>
+            <w:r/>
+            <w:r>
+              <w:rPr>
+                <w:rFonts w:ascii="Times New Roman" w:hAnsi="Times New Roman"/>
+                <w:b w:val="0"/>
+                <w:color w:val="000000"/>
+                <w:sz w:val="28"/>
+              </w:rPr>
+              <w:t>Ляпунов Д.Д.</w:t>
+            </w:r>
+          </w:p>
+        </w:tc>
+      </w:tr>
+      <w:tr>
+        <w:tc>
+          <w:tcPr>
+            <w:tcW w:type="dxa" w:w="1474"/>
+          </w:tcPr>
+          <w:p>
+            <w:r/>
+          </w:p>
+        </w:tc>
+        <w:tc>
+          <w:tcPr>
+            <w:tcW w:type="dxa" w:w="3061"/>
+          </w:tcPr>
+          <w:p>
+            <w:pPr>
+              <w:spacing w:before="0" w:after="0"/>
+              <w:ind w:firstLine="0"/>
+              <w:jc w:val="center"/>
+            </w:pPr>
+            <w:r/>
+            <w:r>
+              <w:rPr>
+                <w:rFonts w:ascii="Times New Roman" w:hAnsi="Times New Roman"/>
+                <w:b w:val="0"/>
+                <w:color w:val="000000"/>
+                <w:sz w:val="28"/>
+              </w:rPr>
+              <w:t>ЭФБО-04-24</w:t>
+            </w:r>
+          </w:p>
+        </w:tc>
+        <w:tc>
+          <w:tcPr>
+            <w:tcW w:type="dxa" w:w="1701"/>
+          </w:tcPr>
+          <w:p>
+            <w:r/>
+          </w:p>
+        </w:tc>
+        <w:tc>
+          <w:tcPr>
+            <w:tcW w:type="dxa" w:w="3118"/>
+          </w:tcPr>
+          <w:p>
+            <w:r/>
+          </w:p>
+        </w:tc>
+      </w:tr>
+      <w:tr>
+        <w:tc>
+          <w:tcPr>
+            <w:tcW w:type="dxa" w:w="1474"/>
+          </w:tcPr>
+          <w:p>
+            <w:pPr>
+              <w:spacing w:before="0" w:after="0"/>
+              <w:ind w:firstLine="0"/>
+              <w:jc w:val="center"/>
+            </w:pPr>
+            <w:r/>
+            <w:r>
+              <w:rPr>
+                <w:rFonts w:ascii="Times New Roman" w:hAnsi="Times New Roman"/>
+                <w:b w:val="0"/>
+                <w:color w:val="000000"/>
+                <w:sz w:val="28"/>
+              </w:rPr>
+              <w:t>Принял:</w:t>
+            </w:r>
+          </w:p>
+        </w:tc>
+        <w:tc>
+          <w:tcPr>
+            <w:tcW w:type="dxa" w:w="3061"/>
+          </w:tcPr>
+          <w:p>
+            <w:pPr>
+              <w:spacing w:before="0" w:after="0"/>
+              <w:ind w:firstLine="0"/>
+              <w:jc w:val="center"/>
+            </w:pPr>
+            <w:r/>
+            <w:r>
+              <w:rPr>
+                <w:rFonts w:ascii="Times New Roman" w:hAnsi="Times New Roman"/>
+                <w:b w:val="0"/>
+                <w:color w:val="000000"/>
+                <w:sz w:val="28"/>
+              </w:rPr>
+              <w:t>ст. преп.</w:t>
+            </w:r>
+          </w:p>
+        </w:tc>
+        <w:tc>
+          <w:tcPr>
+            <w:tcW w:type="dxa" w:w="1701"/>
+          </w:tcPr>
+          <w:p>
+            <w:pPr>
+              <w:spacing w:before="0" w:after="0"/>
+              <w:ind w:firstLine="0"/>
+              <w:jc w:val="center"/>
+            </w:pPr>
+            <w:r/>
+            <w:r>
+              <w:rPr>
+                <w:rFonts w:ascii="Times New Roman" w:hAnsi="Times New Roman"/>
+                <w:b w:val="0"/>
+                <w:color w:val="000000"/>
+                <w:sz w:val="24"/>
+              </w:rPr>
+              <w:t>(подпись)</w:t>
+            </w:r>
+          </w:p>
+        </w:tc>
+        <w:tc>
+          <w:tcPr>
+            <w:tcW w:type="dxa" w:w="3118"/>
+          </w:tcPr>
+          <w:p>
+            <w:pPr>
+              <w:spacing w:before="0" w:after="0"/>
+              <w:ind w:firstLine="0"/>
+              <w:jc w:val="center"/>
+            </w:pPr>
+            <w:r/>
+            <w:r>
+              <w:rPr>
+                <w:rFonts w:ascii="Times New Roman" w:hAnsi="Times New Roman"/>
+                <w:b w:val="0"/>
+                <w:color w:val="000000"/>
+                <w:sz w:val="28"/>
+              </w:rPr>
+              <w:t>Гиматдинов Д.М.</w:t>
+            </w:r>
+          </w:p>
+        </w:tc>
+      </w:tr>
+      <w:tr>
+        <w:tc>
+          <w:tcPr>
+            <w:tcW w:type="dxa" w:w="1474"/>
+          </w:tcPr>
+          <w:p>
+            <w:r/>
+          </w:p>
+        </w:tc>
+        <w:tc>
+          <w:tcPr>
+            <w:tcW w:type="dxa" w:w="3061"/>
+          </w:tcPr>
+          <w:p>
+            <w:pPr>
+              <w:spacing w:before="0" w:after="0"/>
+              <w:ind w:firstLine="0"/>
+              <w:jc w:val="center"/>
+            </w:pPr>
+            <w:r/>
+            <w:r>
+              <w:rPr>
+                <w:rFonts w:ascii="Times New Roman" w:hAnsi="Times New Roman"/>
+                <w:b w:val="0"/>
+                <w:color w:val="000000"/>
+                <w:sz w:val="24"/>
+              </w:rPr>
+              <w:t>(должность)</w:t>
+            </w:r>
+          </w:p>
+        </w:tc>
+        <w:tc>
+          <w:tcPr>
+            <w:tcW w:type="dxa" w:w="1701"/>
+          </w:tcPr>
+          <w:p>
+            <w:r/>
+          </w:p>
+        </w:tc>
+        <w:tc>
+          <w:tcPr>
+            <w:tcW w:type="dxa" w:w="3118"/>
+          </w:tcPr>
+          <w:p>
+            <w:pPr>
+              <w:spacing w:before="0" w:after="0"/>
+              <w:ind w:firstLine="0"/>
+              <w:jc w:val="center"/>
+            </w:pPr>
+            <w:r/>
+            <w:r>
+              <w:rPr>
+                <w:rFonts w:ascii="Times New Roman" w:hAnsi="Times New Roman"/>
+                <w:b w:val="0"/>
+                <w:color w:val="000000"/>
+                <w:sz w:val="24"/>
+              </w:rPr>
+              <w:t>(Фамилия И.О.)</w:t>
+            </w:r>
+          </w:p>
+        </w:tc>
+      </w:tr>
+    </w:tbl>
+    <w:p>
+      <w:pPr>
+        <w:spacing w:before="0" w:after="0"/>
+        <w:ind w:firstLine="0"/>
+      </w:pPr>
+    </w:p>
+    <w:p>
+      <w:pPr>
+        <w:spacing w:before="0" w:after="0"/>
+        <w:ind w:firstLine="0"/>
+      </w:pPr>
+    </w:p>
+    <w:p>
+      <w:pPr>
+        <w:spacing w:before="0" w:after="0"/>
+        <w:ind w:firstLine="0"/>
+      </w:pPr>
+    </w:p>
+    <w:p>
+      <w:pPr>
+        <w:spacing w:before="0" w:after="0"/>
+        <w:ind w:firstLine="0"/>
+        <w:jc w:val="center"/>
+      </w:pPr>
+      <w:r>
+        <w:rPr>
+          <w:rFonts w:ascii="Times New Roman" w:hAnsi="Times New Roman"/>
           <w:b w:val="0"/>
-          <w:i w:val="0"/>
-          <w:sz w:val="24"/>
+          <w:color w:val="000000"/>
+          <w:sz w:val="28"/>
         </w:rPr>
-        <w:t>Служебная информация: отчёт подготовлен по методическим указаниям DEV_5.md от 26.09.2026. Репозиторий: devops-course-2026 (scripts/audit.sh, docs/server-setup.md).</w:t>
+        <w:t>Москва</w:t>
+      </w:r>
+    </w:p>
+    <w:p>
+      <w:pPr>
+        <w:spacing w:before="0" w:after="0"/>
+        <w:ind w:firstLine="0"/>
+        <w:jc w:val="center"/>
+      </w:pPr>
+      <w:r>
+        <w:rPr>
+          <w:rFonts w:ascii="Times New Roman" w:hAnsi="Times New Roman"/>
+          <w:b w:val="0"/>
+          <w:color w:val="000000"/>
+          <w:sz w:val="28"/>
+        </w:rPr>
+        <w:t>2026</w:t>
       </w:r>
     </w:p>
     <w:p>
@@ -126,7 +678,7 @@
         <w:rPr>
           <w:sz w:val="24"/>
         </w:rPr>
-        <w:t>Таблица 1 – Параметры виртуальной машины devops-vm</w:t>
+        <w:t>Таблица 1 — Параметры виртуальной машины devops-vm</w:t>
       </w:r>
     </w:p>
     <w:tbl>
@@ -134,17 +686,17 @@
         <w:tblStyle w:val="TableGrid"/>
         <w:tblW w:type="auto" w:w="0"/>
         <w:jc w:val="center"/>
-        <w:tblLayout w:type="autofit"/>
+        <w:tblLayout w:type="fixed"/>
         <w:tblLook w:firstColumn="1" w:firstRow="1" w:lastColumn="0" w:lastRow="0" w:noHBand="0" w:noVBand="1" w:val="04A0"/>
       </w:tblPr>
       <w:tblGrid>
-        <w:gridCol w:w="4819"/>
-        <w:gridCol w:w="4819"/>
+        <w:gridCol w:w="4677"/>
+        <w:gridCol w:w="4677"/>
       </w:tblGrid>
       <w:tr>
         <w:tc>
           <w:tcPr>
-            <w:tcW w:type="dxa" w:w="4819"/>
+            <w:tcW w:type="dxa" w:w="3118"/>
           </w:tcPr>
           <w:p>
             <w:pPr>
@@ -156,6 +708,7 @@
               <w:rPr>
                 <w:rFonts w:ascii="Times New Roman" w:hAnsi="Times New Roman"/>
                 <w:b/>
+                <w:color w:val="000000"/>
                 <w:sz w:val="24"/>
               </w:rPr>
               <w:t>Параметр</w:t>
@@ -164,7 +717,7 @@
         </w:tc>
         <w:tc>
           <w:tcPr>
-            <w:tcW w:type="dxa" w:w="4819"/>
+            <w:tcW w:type="dxa" w:w="6236"/>
           </w:tcPr>
           <w:p>
             <w:pPr>
@@ -176,6 +729,7 @@
               <w:rPr>
                 <w:rFonts w:ascii="Times New Roman" w:hAnsi="Times New Roman"/>
                 <w:b/>
+                <w:color w:val="000000"/>
                 <w:sz w:val="24"/>
               </w:rPr>
               <w:t>Значение</w:t>
@@ -186,7 +740,7 @@
       <w:tr>
         <w:tc>
           <w:tcPr>
-            <w:tcW w:type="dxa" w:w="4819"/>
+            <w:tcW w:type="dxa" w:w="3118"/>
           </w:tcPr>
           <w:p>
             <w:pPr>
@@ -197,6 +751,7 @@
             <w:r>
               <w:rPr>
                 <w:rFonts w:ascii="Times New Roman" w:hAnsi="Times New Roman"/>
+                <w:color w:val="000000"/>
                 <w:sz w:val="24"/>
               </w:rPr>
               <w:t>Имя</w:t>
@@ -205,7 +760,7 @@
         </w:tc>
         <w:tc>
           <w:tcPr>
-            <w:tcW w:type="dxa" w:w="4819"/>
+            <w:tcW w:type="dxa" w:w="6236"/>
           </w:tcPr>
           <w:p>
             <w:pPr>
@@ -216,6 +771,7 @@
             <w:r>
               <w:rPr>
                 <w:rFonts w:ascii="Times New Roman" w:hAnsi="Times New Roman"/>
+                <w:color w:val="000000"/>
                 <w:sz w:val="24"/>
               </w:rPr>
               <w:t>devops-vm</w:t>
@@ -226,7 +782,7 @@
       <w:tr>
         <w:tc>
           <w:tcPr>
-            <w:tcW w:type="dxa" w:w="4819"/>
+            <w:tcW w:type="dxa" w:w="3118"/>
           </w:tcPr>
           <w:p>
             <w:pPr>
@@ -237,6 +793,7 @@
             <w:r>
               <w:rPr>
                 <w:rFonts w:ascii="Times New Roman" w:hAnsi="Times New Roman"/>
+                <w:color w:val="000000"/>
                 <w:sz w:val="24"/>
               </w:rPr>
               <w:t>Тип гостевой ОС</w:t>
@@ -245,7 +802,7 @@
         </w:tc>
         <w:tc>
           <w:tcPr>
-            <w:tcW w:type="dxa" w:w="4819"/>
+            <w:tcW w:type="dxa" w:w="6236"/>
           </w:tcPr>
           <w:p>
             <w:pPr>
@@ -256,6 +813,7 @@
             <w:r>
               <w:rPr>
                 <w:rFonts w:ascii="Times New Roman" w:hAnsi="Times New Roman"/>
+                <w:color w:val="000000"/>
                 <w:sz w:val="24"/>
               </w:rPr>
               <w:t>Linux / Ubuntu (64-bit)</w:t>
@@ -266,7 +824,7 @@
       <w:tr>
         <w:tc>
           <w:tcPr>
-            <w:tcW w:type="dxa" w:w="4819"/>
+            <w:tcW w:type="dxa" w:w="3118"/>
           </w:tcPr>
           <w:p>
             <w:pPr>
@@ -277,6 +835,7 @@
             <w:r>
               <w:rPr>
                 <w:rFonts w:ascii="Times New Roman" w:hAnsi="Times New Roman"/>
+                <w:color w:val="000000"/>
                 <w:sz w:val="24"/>
               </w:rPr>
               <w:t>Память</w:t>
@@ -285,7 +844,7 @@
         </w:tc>
         <w:tc>
           <w:tcPr>
-            <w:tcW w:type="dxa" w:w="4819"/>
+            <w:tcW w:type="dxa" w:w="6236"/>
           </w:tcPr>
           <w:p>
             <w:pPr>
@@ -296,6 +855,7 @@
             <w:r>
               <w:rPr>
                 <w:rFonts w:ascii="Times New Roman" w:hAnsi="Times New Roman"/>
+                <w:color w:val="000000"/>
                 <w:sz w:val="24"/>
               </w:rPr>
               <w:t>2048 МБ</w:t>
@@ -306,7 +866,7 @@
       <w:tr>
         <w:tc>
           <w:tcPr>
-            <w:tcW w:type="dxa" w:w="4819"/>
+            <w:tcW w:type="dxa" w:w="3118"/>
           </w:tcPr>
           <w:p>
             <w:pPr>
@@ -317,6 +877,7 @@
             <w:r>
               <w:rPr>
                 <w:rFonts w:ascii="Times New Roman" w:hAnsi="Times New Roman"/>
+                <w:color w:val="000000"/>
                 <w:sz w:val="24"/>
               </w:rPr>
               <w:t>Процессор</w:t>
@@ -325,7 +886,7 @@
         </w:tc>
         <w:tc>
           <w:tcPr>
-            <w:tcW w:type="dxa" w:w="4819"/>
+            <w:tcW w:type="dxa" w:w="6236"/>
           </w:tcPr>
           <w:p>
             <w:pPr>
@@ -336,6 +897,7 @@
             <w:r>
               <w:rPr>
                 <w:rFonts w:ascii="Times New Roman" w:hAnsi="Times New Roman"/>
+                <w:color w:val="000000"/>
                 <w:sz w:val="24"/>
               </w:rPr>
               <w:t>2 ядра</w:t>
@@ -346,7 +908,7 @@
       <w:tr>
         <w:tc>
           <w:tcPr>
-            <w:tcW w:type="dxa" w:w="4819"/>
+            <w:tcW w:type="dxa" w:w="3118"/>
           </w:tcPr>
           <w:p>
             <w:pPr>
@@ -357,6 +919,7 @@
             <w:r>
               <w:rPr>
                 <w:rFonts w:ascii="Times New Roman" w:hAnsi="Times New Roman"/>
+                <w:color w:val="000000"/>
                 <w:sz w:val="24"/>
               </w:rPr>
               <w:t>Диск</w:t>
@@ -365,7 +928,7 @@
         </w:tc>
         <w:tc>
           <w:tcPr>
-            <w:tcW w:type="dxa" w:w="4819"/>
+            <w:tcW w:type="dxa" w:w="6236"/>
           </w:tcPr>
           <w:p>
             <w:pPr>
@@ -376,6 +939,7 @@
             <w:r>
               <w:rPr>
                 <w:rFonts w:ascii="Times New Roman" w:hAnsi="Times New Roman"/>
+                <w:color w:val="000000"/>
                 <w:sz w:val="24"/>
               </w:rPr>
               <w:t>25 ГБ, динамически расширяемый, Use an entire disk</w:t>
@@ -386,7 +950,7 @@
       <w:tr>
         <w:tc>
           <w:tcPr>
-            <w:tcW w:type="dxa" w:w="4819"/>
+            <w:tcW w:type="dxa" w:w="3118"/>
           </w:tcPr>
           <w:p>
             <w:pPr>
@@ -397,6 +961,7 @@
             <w:r>
               <w:rPr>
                 <w:rFonts w:ascii="Times New Roman" w:hAnsi="Times New Roman"/>
+                <w:color w:val="000000"/>
                 <w:sz w:val="24"/>
               </w:rPr>
               <w:t>Адаптер 1</w:t>
@@ -405,7 +970,7 @@
         </w:tc>
         <w:tc>
           <w:tcPr>
-            <w:tcW w:type="dxa" w:w="4819"/>
+            <w:tcW w:type="dxa" w:w="6236"/>
           </w:tcPr>
           <w:p>
             <w:pPr>
@@ -416,6 +981,7 @@
             <w:r>
               <w:rPr>
                 <w:rFonts w:ascii="Times New Roman" w:hAnsi="Times New Roman"/>
+                <w:color w:val="000000"/>
                 <w:sz w:val="24"/>
               </w:rPr>
               <w:t>NAT (доступ в Интернет, apt)</w:t>
@@ -426,7 +992,7 @@
       <w:tr>
         <w:tc>
           <w:tcPr>
-            <w:tcW w:type="dxa" w:w="4819"/>
+            <w:tcW w:type="dxa" w:w="3118"/>
           </w:tcPr>
           <w:p>
             <w:pPr>
@@ -437,6 +1003,7 @@
             <w:r>
               <w:rPr>
                 <w:rFonts w:ascii="Times New Roman" w:hAnsi="Times New Roman"/>
+                <w:color w:val="000000"/>
                 <w:sz w:val="24"/>
               </w:rPr>
               <w:t>Адаптер 2</w:t>
@@ -445,7 +1012,7 @@
         </w:tc>
         <w:tc>
           <w:tcPr>
-            <w:tcW w:type="dxa" w:w="4819"/>
+            <w:tcW w:type="dxa" w:w="6236"/>
           </w:tcPr>
           <w:p>
             <w:pPr>
@@ -456,6 +1023,7 @@
             <w:r>
               <w:rPr>
                 <w:rFonts w:ascii="Times New Roman" w:hAnsi="Times New Roman"/>
+                <w:color w:val="000000"/>
                 <w:sz w:val="24"/>
               </w:rPr>
               <w:t>Host-only (связка с хостом, будущий Nginx)</w:t>
@@ -522,7 +1090,7 @@
       <w:r>
         <w:rPr>
           <w:rFonts w:ascii="Consolas" w:hAnsi="Consolas"/>
-          <w:color w:val="1A1A1A"/>
+          <w:color w:val="000000"/>
           <w:sz w:val="21"/>
         </w:rPr>
         <w:t>sudo apt update &amp;&amp; sudo apt upgrade -y</w:t>
@@ -537,7 +1105,7 @@
       <w:r>
         <w:rPr>
           <w:rFonts w:ascii="Consolas" w:hAnsi="Consolas"/>
-          <w:color w:val="1A1A1A"/>
+          <w:color w:val="000000"/>
           <w:sz w:val="21"/>
         </w:rPr>
         <w:t>ip -brief address</w:t>
@@ -552,7 +1120,7 @@
         <w:drawing>
           <wp:inline xmlns:a="http://schemas.openxmlformats.org/drawingml/2006/main" xmlns:pic="http://schemas.openxmlformats.org/drawingml/2006/picture">
             <wp:extent cx="5400000" cy="1683425"/>
-            <wp:docPr id="1" name="Picture 1"/>
+            <wp:docPr id="2" name="Picture 2"/>
             <wp:cNvGraphicFramePr>
               <a:graphicFrameLocks noChangeAspect="1"/>
             </wp:cNvGraphicFramePr>
@@ -564,7 +1132,7 @@
                     <pic:cNvPicPr/>
                   </pic:nvPicPr>
                   <pic:blipFill>
-                    <a:blip r:embed="rId10"/>
+                    <a:blip r:embed="rId11"/>
                     <a:stretch>
                       <a:fillRect/>
                     </a:stretch>
@@ -592,9 +1160,10 @@
       <w:r>
         <w:rPr>
           <w:i w:val="0"/>
+          <w:color w:val="000000"/>
           <w:sz w:val="24"/>
         </w:rPr>
-        <w:t>Рисунок 1 – вывод ip -brief address: интерфейсы NAT (10.0.2.15) и Host-only (192.168.56.101), служба SSH запущена</w:t>
+        <w:t>Рисунок 1 — вывод ip -brief address: интерфейсы NAT (10.0.2.15) и Host-only (192.168.56.101), служба SSH запущена</w:t>
       </w:r>
     </w:p>
     <w:p>
@@ -632,7 +1201,7 @@
         <w:drawing>
           <wp:inline xmlns:a="http://schemas.openxmlformats.org/drawingml/2006/main" xmlns:pic="http://schemas.openxmlformats.org/drawingml/2006/picture">
             <wp:extent cx="5400000" cy="1368000"/>
-            <wp:docPr id="2" name="Picture 2"/>
+            <wp:docPr id="3" name="Picture 3"/>
             <wp:cNvGraphicFramePr>
               <a:graphicFrameLocks noChangeAspect="1"/>
             </wp:cNvGraphicFramePr>
@@ -644,7 +1213,7 @@
                     <pic:cNvPicPr/>
                   </pic:nvPicPr>
                   <pic:blipFill>
-                    <a:blip r:embed="rId11"/>
+                    <a:blip r:embed="rId12"/>
                     <a:stretch>
                       <a:fillRect/>
                     </a:stretch>
@@ -672,9 +1241,10 @@
       <w:r>
         <w:rPr>
           <w:i w:val="0"/>
+          <w:color w:val="000000"/>
           <w:sz w:val="24"/>
         </w:rPr>
-        <w:t>Рисунок 2 – менеджер снимков: три контрольные точки работы</w:t>
+        <w:t>Рисунок 2 — менеджер снимков: три контрольные точки работы</w:t>
       </w:r>
     </w:p>
     <w:p>
@@ -720,7 +1290,7 @@
       <w:r>
         <w:rPr>
           <w:rFonts w:ascii="Consolas" w:hAnsi="Consolas"/>
-          <w:color w:val="1A1A1A"/>
+          <w:color w:val="000000"/>
           <w:sz w:val="21"/>
         </w:rPr>
         <w:t>ssh student@127.0.0.1 -p 2222</w:t>
@@ -735,7 +1305,7 @@
       <w:r>
         <w:rPr>
           <w:rFonts w:ascii="Consolas" w:hAnsi="Consolas"/>
-          <w:color w:val="1A1A1A"/>
+          <w:color w:val="000000"/>
           <w:sz w:val="21"/>
         </w:rPr>
         <w:t>sudo adduser devops</w:t>
@@ -750,7 +1320,7 @@
       <w:r>
         <w:rPr>
           <w:rFonts w:ascii="Consolas" w:hAnsi="Consolas"/>
-          <w:color w:val="1A1A1A"/>
+          <w:color w:val="000000"/>
           <w:sz w:val="21"/>
         </w:rPr>
         <w:t>sudo usermod -aG sudo devops</w:t>
@@ -765,7 +1335,7 @@
       <w:r>
         <w:rPr>
           <w:rFonts w:ascii="Consolas" w:hAnsi="Consolas"/>
-          <w:color w:val="1A1A1A"/>
+          <w:color w:val="000000"/>
           <w:sz w:val="21"/>
         </w:rPr>
         <w:t>groups devops</w:t>
@@ -797,7 +1367,7 @@
       <w:r>
         <w:rPr>
           <w:rFonts w:ascii="Consolas" w:hAnsi="Consolas"/>
-          <w:color w:val="1A1A1A"/>
+          <w:color w:val="000000"/>
           <w:sz w:val="21"/>
         </w:rPr>
         <w:t>ssh-keygen -t ed25519 -C "devops-vm-key" -f ~/.ssh/devops_vm</w:t>
@@ -812,7 +1382,7 @@
       <w:r>
         <w:rPr>
           <w:rFonts w:ascii="Consolas" w:hAnsi="Consolas"/>
-          <w:color w:val="1A1A1A"/>
+          <w:color w:val="000000"/>
           <w:sz w:val="21"/>
         </w:rPr>
         <w:t>ssh-copy-id -i ~/.ssh/devops_vm.pub -p 2222 devops@127.0.0.1</w:t>
@@ -827,7 +1397,7 @@
         <w:drawing>
           <wp:inline xmlns:a="http://schemas.openxmlformats.org/drawingml/2006/main" xmlns:pic="http://schemas.openxmlformats.org/drawingml/2006/picture">
             <wp:extent cx="5400000" cy="1872000"/>
-            <wp:docPr id="3" name="Picture 3"/>
+            <wp:docPr id="4" name="Picture 4"/>
             <wp:cNvGraphicFramePr>
               <a:graphicFrameLocks noChangeAspect="1"/>
             </wp:cNvGraphicFramePr>
@@ -839,7 +1409,7 @@
                     <pic:cNvPicPr/>
                   </pic:nvPicPr>
                   <pic:blipFill>
-                    <a:blip r:embed="rId12"/>
+                    <a:blip r:embed="rId13"/>
                     <a:stretch>
                       <a:fillRect/>
                     </a:stretch>
@@ -867,9 +1437,10 @@
       <w:r>
         <w:rPr>
           <w:i w:val="0"/>
+          <w:color w:val="000000"/>
           <w:sz w:val="24"/>
         </w:rPr>
-        <w:t>Рисунок 3 – права 700/600 и вход командой ssh devops без запроса пароля</w:t>
+        <w:t>Рисунок 3 — права 700/600 и вход командой ssh devops без запроса пароля</w:t>
       </w:r>
     </w:p>
     <w:p>
@@ -898,7 +1469,7 @@
       <w:r>
         <w:rPr>
           <w:rFonts w:ascii="Consolas" w:hAnsi="Consolas"/>
-          <w:color w:val="1A1A1A"/>
+          <w:color w:val="000000"/>
           <w:sz w:val="21"/>
         </w:rPr>
         <w:t>ssh -vvv -i ~/.ssh/devops_vm -p 2222 devops@127.0.0.1 2&gt;&amp;1 | grep -i "authentications that can continue"</w:t>
@@ -913,7 +1484,7 @@
         <w:drawing>
           <wp:inline xmlns:a="http://schemas.openxmlformats.org/drawingml/2006/main" xmlns:pic="http://schemas.openxmlformats.org/drawingml/2006/picture">
             <wp:extent cx="5400000" cy="1057786"/>
-            <wp:docPr id="4" name="Picture 4"/>
+            <wp:docPr id="5" name="Picture 5"/>
             <wp:cNvGraphicFramePr>
               <a:graphicFrameLocks noChangeAspect="1"/>
             </wp:cNvGraphicFramePr>
@@ -925,7 +1496,7 @@
                     <pic:cNvPicPr/>
                   </pic:nvPicPr>
                   <pic:blipFill>
-                    <a:blip r:embed="rId13"/>
+                    <a:blip r:embed="rId14"/>
                     <a:stretch>
                       <a:fillRect/>
                     </a:stretch>
@@ -953,9 +1524,10 @@
       <w:r>
         <w:rPr>
           <w:i w:val="0"/>
+          <w:color w:val="000000"/>
           <w:sz w:val="24"/>
         </w:rPr>
-        <w:t>Рисунок 4 – строка Authentications that can continue до hardening: publickey,password</w:t>
+        <w:t>Рисунок 4 — строка Authentications that can continue до hardening: publickey,password</w:t>
       </w:r>
     </w:p>
     <w:p>
@@ -1019,7 +1591,7 @@
       <w:r>
         <w:rPr>
           <w:rFonts w:ascii="Consolas" w:hAnsi="Consolas"/>
-          <w:color w:val="1A1A1A"/>
+          <w:color w:val="000000"/>
           <w:sz w:val="21"/>
         </w:rPr>
         <w:t>Port 2222</w:t>
@@ -1034,7 +1606,7 @@
       <w:r>
         <w:rPr>
           <w:rFonts w:ascii="Consolas" w:hAnsi="Consolas"/>
-          <w:color w:val="1A1A1A"/>
+          <w:color w:val="000000"/>
           <w:sz w:val="21"/>
         </w:rPr>
         <w:t>PermitRootLogin no</w:t>
@@ -1049,7 +1621,7 @@
       <w:r>
         <w:rPr>
           <w:rFonts w:ascii="Consolas" w:hAnsi="Consolas"/>
-          <w:color w:val="1A1A1A"/>
+          <w:color w:val="000000"/>
           <w:sz w:val="21"/>
         </w:rPr>
         <w:t>PasswordAuthentication no</w:t>
@@ -1064,7 +1636,7 @@
       <w:r>
         <w:rPr>
           <w:rFonts w:ascii="Consolas" w:hAnsi="Consolas"/>
-          <w:color w:val="1A1A1A"/>
+          <w:color w:val="000000"/>
           <w:sz w:val="21"/>
         </w:rPr>
         <w:t>PubkeyAuthentication yes</w:t>
@@ -1079,7 +1651,7 @@
       <w:r>
         <w:rPr>
           <w:rFonts w:ascii="Consolas" w:hAnsi="Consolas"/>
-          <w:color w:val="1A1A1A"/>
+          <w:color w:val="000000"/>
           <w:sz w:val="21"/>
         </w:rPr>
         <w:t>PermitEmptyPasswords no</w:t>
@@ -1094,7 +1666,7 @@
       <w:r>
         <w:rPr>
           <w:rFonts w:ascii="Consolas" w:hAnsi="Consolas"/>
-          <w:color w:val="1A1A1A"/>
+          <w:color w:val="000000"/>
           <w:sz w:val="21"/>
         </w:rPr>
         <w:t>MaxAuthTries 3</w:t>
@@ -1109,7 +1681,7 @@
       <w:r>
         <w:rPr>
           <w:rFonts w:ascii="Consolas" w:hAnsi="Consolas"/>
-          <w:color w:val="1A1A1A"/>
+          <w:color w:val="000000"/>
           <w:sz w:val="21"/>
         </w:rPr>
         <w:t>LoginGraceTime 30</w:t>
@@ -1124,7 +1696,7 @@
       <w:r>
         <w:rPr>
           <w:rFonts w:ascii="Consolas" w:hAnsi="Consolas"/>
-          <w:color w:val="1A1A1A"/>
+          <w:color w:val="000000"/>
           <w:sz w:val="21"/>
         </w:rPr>
         <w:t>AllowUsers devops</w:t>
@@ -1139,7 +1711,7 @@
       <w:r>
         <w:rPr>
           <w:rFonts w:ascii="Consolas" w:hAnsi="Consolas"/>
-          <w:color w:val="1A1A1A"/>
+          <w:color w:val="000000"/>
           <w:sz w:val="21"/>
         </w:rPr>
         <w:t>X11Forwarding no</w:t>
@@ -1154,7 +1726,7 @@
       <w:r>
         <w:rPr>
           <w:rFonts w:ascii="Consolas" w:hAnsi="Consolas"/>
-          <w:color w:val="1A1A1A"/>
+          <w:color w:val="000000"/>
           <w:sz w:val="21"/>
         </w:rPr>
         <w:t>ClientAliveInterval 300</w:t>
@@ -1169,7 +1741,7 @@
       <w:r>
         <w:rPr>
           <w:rFonts w:ascii="Consolas" w:hAnsi="Consolas"/>
-          <w:color w:val="1A1A1A"/>
+          <w:color w:val="000000"/>
           <w:sz w:val="21"/>
         </w:rPr>
         <w:t>ClientAliveCountMax 2</w:t>
@@ -1201,7 +1773,7 @@
       <w:r>
         <w:rPr>
           <w:rFonts w:ascii="Consolas" w:hAnsi="Consolas"/>
-          <w:color w:val="1A1A1A"/>
+          <w:color w:val="000000"/>
           <w:sz w:val="21"/>
         </w:rPr>
         <w:t>sudo sshd -t &amp;&amp; echo "Конфигурация корректна"</w:t>
@@ -1216,7 +1788,7 @@
       <w:r>
         <w:rPr>
           <w:rFonts w:ascii="Consolas" w:hAnsi="Consolas"/>
-          <w:color w:val="1A1A1A"/>
+          <w:color w:val="000000"/>
           <w:sz w:val="21"/>
         </w:rPr>
         <w:t>sudo sshd -T | grep -Ei "^(port|permitrootlogin|passwordauthentication|maxauthtries|allowusers)"</w:t>
@@ -1231,7 +1803,7 @@
         <w:drawing>
           <wp:inline xmlns:a="http://schemas.openxmlformats.org/drawingml/2006/main" xmlns:pic="http://schemas.openxmlformats.org/drawingml/2006/picture">
             <wp:extent cx="5400000" cy="2040000"/>
-            <wp:docPr id="5" name="Picture 5"/>
+            <wp:docPr id="6" name="Picture 6"/>
             <wp:cNvGraphicFramePr>
               <a:graphicFrameLocks noChangeAspect="1"/>
             </wp:cNvGraphicFramePr>
@@ -1243,7 +1815,7 @@
                     <pic:cNvPicPr/>
                   </pic:nvPicPr>
                   <pic:blipFill>
-                    <a:blip r:embed="rId14"/>
+                    <a:blip r:embed="rId15"/>
                     <a:stretch>
                       <a:fillRect/>
                     </a:stretch>
@@ -1271,9 +1843,10 @@
       <w:r>
         <w:rPr>
           <w:i w:val="0"/>
+          <w:color w:val="000000"/>
           <w:sz w:val="24"/>
         </w:rPr>
-        <w:t>Рисунок 5 – вывод sshd -T: действующие значения директив</w:t>
+        <w:t>Рисунок 5 — вывод sshd -T: действующие значения директив</w:t>
       </w:r>
     </w:p>
     <w:p>
@@ -1302,7 +1875,7 @@
       <w:r>
         <w:rPr>
           <w:rFonts w:ascii="Consolas" w:hAnsi="Consolas"/>
-          <w:color w:val="1A1A1A"/>
+          <w:color w:val="000000"/>
           <w:sz w:val="21"/>
         </w:rPr>
         <w:t>sudo systemctl disable --now ssh.socket</w:t>
@@ -1317,7 +1890,7 @@
       <w:r>
         <w:rPr>
           <w:rFonts w:ascii="Consolas" w:hAnsi="Consolas"/>
-          <w:color w:val="1A1A1A"/>
+          <w:color w:val="000000"/>
           <w:sz w:val="21"/>
         </w:rPr>
         <w:t>sudo systemctl enable --now ssh.service</w:t>
@@ -1332,7 +1905,7 @@
       <w:r>
         <w:rPr>
           <w:rFonts w:ascii="Consolas" w:hAnsi="Consolas"/>
-          <w:color w:val="1A1A1A"/>
+          <w:color w:val="000000"/>
           <w:sz w:val="21"/>
         </w:rPr>
         <w:t>sudo systemctl restart ssh</w:t>
@@ -1347,7 +1920,7 @@
       <w:r>
         <w:rPr>
           <w:rFonts w:ascii="Consolas" w:hAnsi="Consolas"/>
-          <w:color w:val="1A1A1A"/>
+          <w:color w:val="000000"/>
           <w:sz w:val="21"/>
         </w:rPr>
         <w:t>sudo ss -tlnp | grep sshd  # ожидается 0.0.0.0:2222</w:t>
@@ -1362,7 +1935,7 @@
         <w:drawing>
           <wp:inline xmlns:a="http://schemas.openxmlformats.org/drawingml/2006/main" xmlns:pic="http://schemas.openxmlformats.org/drawingml/2006/picture">
             <wp:extent cx="5400000" cy="1200000"/>
-            <wp:docPr id="6" name="Picture 6"/>
+            <wp:docPr id="7" name="Picture 7"/>
             <wp:cNvGraphicFramePr>
               <a:graphicFrameLocks noChangeAspect="1"/>
             </wp:cNvGraphicFramePr>
@@ -1374,7 +1947,7 @@
                     <pic:cNvPicPr/>
                   </pic:nvPicPr>
                   <pic:blipFill>
-                    <a:blip r:embed="rId15"/>
+                    <a:blip r:embed="rId16"/>
                     <a:stretch>
                       <a:fillRect/>
                     </a:stretch>
@@ -1402,9 +1975,10 @@
       <w:r>
         <w:rPr>
           <w:i w:val="0"/>
+          <w:color w:val="000000"/>
           <w:sz w:val="24"/>
         </w:rPr>
-        <w:t>Рисунок 6 – вывод ss: sshd слушает порт 2222</w:t>
+        <w:t>Рисунок 6 — вывод ss: sshd слушает порт 2222</w:t>
       </w:r>
     </w:p>
     <w:p>
@@ -1433,7 +2007,7 @@
       <w:r>
         <w:rPr>
           <w:rFonts w:ascii="Consolas" w:hAnsi="Consolas"/>
-          <w:color w:val="1A1A1A"/>
+          <w:color w:val="000000"/>
           <w:sz w:val="21"/>
         </w:rPr>
         <w:t>ssh devops                                             # ожидается успех</w:t>
@@ -1448,7 +2022,7 @@
       <w:r>
         <w:rPr>
           <w:rFonts w:ascii="Consolas" w:hAnsi="Consolas"/>
-          <w:color w:val="1A1A1A"/>
+          <w:color w:val="000000"/>
           <w:sz w:val="21"/>
         </w:rPr>
         <w:t>ssh -p 2222 root@127.0.0.1                            # ожидается отказ</w:t>
@@ -1463,7 +2037,7 @@
       <w:r>
         <w:rPr>
           <w:rFonts w:ascii="Consolas" w:hAnsi="Consolas"/>
-          <w:color w:val="1A1A1A"/>
+          <w:color w:val="000000"/>
           <w:sz w:val="21"/>
         </w:rPr>
         <w:t>ssh -p 2222 -o PubkeyAuthentication=no devops@127.0.0.1  # ожидается отказ</w:t>
@@ -1478,7 +2052,7 @@
         <w:drawing>
           <wp:inline xmlns:a="http://schemas.openxmlformats.org/drawingml/2006/main" xmlns:pic="http://schemas.openxmlformats.org/drawingml/2006/picture">
             <wp:extent cx="5400000" cy="1536000"/>
-            <wp:docPr id="7" name="Picture 7"/>
+            <wp:docPr id="8" name="Picture 8"/>
             <wp:cNvGraphicFramePr>
               <a:graphicFrameLocks noChangeAspect="1"/>
             </wp:cNvGraphicFramePr>
@@ -1490,7 +2064,7 @@
                     <pic:cNvPicPr/>
                   </pic:nvPicPr>
                   <pic:blipFill>
-                    <a:blip r:embed="rId16"/>
+                    <a:blip r:embed="rId17"/>
                     <a:stretch>
                       <a:fillRect/>
                     </a:stretch>
@@ -1518,9 +2092,10 @@
       <w:r>
         <w:rPr>
           <w:i w:val="0"/>
+          <w:color w:val="000000"/>
           <w:sz w:val="24"/>
         </w:rPr>
-        <w:t>Рисунок 7 – две отклонённые попытки подключения</w:t>
+        <w:t>Рисунок 7 — две отклонённые попытки подключения</w:t>
       </w:r>
     </w:p>
     <w:p>
@@ -1541,7 +2116,7 @@
       <w:r>
         <w:rPr>
           <w:rFonts w:ascii="Consolas" w:hAnsi="Consolas"/>
-          <w:color w:val="1A1A1A"/>
+          <w:color w:val="000000"/>
           <w:sz w:val="21"/>
         </w:rPr>
         <w:t>sudo journalctl -u ssh --since "10 min ago" --no-pager | grep -Ei "invalid|failed|denied"</w:t>
@@ -1556,7 +2131,7 @@
         <w:drawing>
           <wp:inline xmlns:a="http://schemas.openxmlformats.org/drawingml/2006/main" xmlns:pic="http://schemas.openxmlformats.org/drawingml/2006/picture">
             <wp:extent cx="5400000" cy="1234286"/>
-            <wp:docPr id="8" name="Picture 8"/>
+            <wp:docPr id="9" name="Picture 9"/>
             <wp:cNvGraphicFramePr>
               <a:graphicFrameLocks noChangeAspect="1"/>
             </wp:cNvGraphicFramePr>
@@ -1568,7 +2143,7 @@
                     <pic:cNvPicPr/>
                   </pic:nvPicPr>
                   <pic:blipFill>
-                    <a:blip r:embed="rId17"/>
+                    <a:blip r:embed="rId18"/>
                     <a:stretch>
                       <a:fillRect/>
                     </a:stretch>
@@ -1596,9 +2171,10 @@
       <w:r>
         <w:rPr>
           <w:i w:val="0"/>
+          <w:color w:val="000000"/>
           <w:sz w:val="24"/>
         </w:rPr>
-        <w:t>Рисунок 8 – записи системного журнала SSH</w:t>
+        <w:t>Рисунок 8 — записи системного журнала SSH</w:t>
       </w:r>
     </w:p>
     <w:p>
@@ -1644,7 +2220,7 @@
       <w:r>
         <w:rPr>
           <w:rFonts w:ascii="Consolas" w:hAnsi="Consolas"/>
-          <w:color w:val="1A1A1A"/>
+          <w:color w:val="000000"/>
           <w:sz w:val="21"/>
         </w:rPr>
         <w:t>sudo ufw status verbose   # ожидается Status: inactive</w:t>
@@ -1659,7 +2235,7 @@
       <w:r>
         <w:rPr>
           <w:rFonts w:ascii="Consolas" w:hAnsi="Consolas"/>
-          <w:color w:val="1A1A1A"/>
+          <w:color w:val="000000"/>
           <w:sz w:val="21"/>
         </w:rPr>
         <w:t>sudo ufw default deny incoming</w:t>
@@ -1674,7 +2250,7 @@
       <w:r>
         <w:rPr>
           <w:rFonts w:ascii="Consolas" w:hAnsi="Consolas"/>
-          <w:color w:val="1A1A1A"/>
+          <w:color w:val="000000"/>
           <w:sz w:val="21"/>
         </w:rPr>
         <w:t>sudo ufw default allow outgoing</w:t>
@@ -1689,7 +2265,7 @@
       <w:r>
         <w:rPr>
           <w:rFonts w:ascii="Consolas" w:hAnsi="Consolas"/>
-          <w:color w:val="1A1A1A"/>
+          <w:color w:val="000000"/>
           <w:sz w:val="21"/>
         </w:rPr>
         <w:t>sudo ufw allow 2222/tcp comment 'SSH'</w:t>
@@ -1704,7 +2280,7 @@
       <w:r>
         <w:rPr>
           <w:rFonts w:ascii="Consolas" w:hAnsi="Consolas"/>
-          <w:color w:val="1A1A1A"/>
+          <w:color w:val="000000"/>
           <w:sz w:val="21"/>
         </w:rPr>
         <w:t>sudo ufw allow 80/tcp comment 'HTTP'</w:t>
@@ -1719,7 +2295,7 @@
       <w:r>
         <w:rPr>
           <w:rFonts w:ascii="Consolas" w:hAnsi="Consolas"/>
-          <w:color w:val="1A1A1A"/>
+          <w:color w:val="000000"/>
           <w:sz w:val="21"/>
         </w:rPr>
         <w:t>sudo ufw allow 443/tcp comment 'HTTPS'</w:t>
@@ -1743,7 +2319,7 @@
       <w:r>
         <w:rPr>
           <w:rFonts w:ascii="Consolas" w:hAnsi="Consolas"/>
-          <w:color w:val="1A1A1A"/>
+          <w:color w:val="000000"/>
           <w:sz w:val="21"/>
         </w:rPr>
         <w:t>sudo ufw enable</w:t>
@@ -1758,7 +2334,7 @@
       <w:r>
         <w:rPr>
           <w:rFonts w:ascii="Consolas" w:hAnsi="Consolas"/>
-          <w:color w:val="1A1A1A"/>
+          <w:color w:val="000000"/>
           <w:sz w:val="21"/>
         </w:rPr>
         <w:t>sudo ufw status numbered</w:t>
@@ -1790,7 +2366,7 @@
       <w:r>
         <w:rPr>
           <w:rFonts w:ascii="Consolas" w:hAnsi="Consolas"/>
-          <w:color w:val="1A1A1A"/>
+          <w:color w:val="000000"/>
           <w:sz w:val="21"/>
         </w:rPr>
         <w:t>sudo ufw delete allow 2222/tcp</w:t>
@@ -1805,7 +2381,7 @@
       <w:r>
         <w:rPr>
           <w:rFonts w:ascii="Consolas" w:hAnsi="Consolas"/>
-          <w:color w:val="1A1A1A"/>
+          <w:color w:val="000000"/>
           <w:sz w:val="21"/>
         </w:rPr>
         <w:t>sudo ufw limit 2222/tcp comment 'SSH rate-limited'</w:t>
@@ -1820,7 +2396,7 @@
       <w:r>
         <w:rPr>
           <w:rFonts w:ascii="Consolas" w:hAnsi="Consolas"/>
-          <w:color w:val="1A1A1A"/>
+          <w:color w:val="000000"/>
           <w:sz w:val="21"/>
         </w:rPr>
         <w:t>sudo ufw status verbose</w:t>
@@ -1835,7 +2411,7 @@
         <w:drawing>
           <wp:inline xmlns:a="http://schemas.openxmlformats.org/drawingml/2006/main" xmlns:pic="http://schemas.openxmlformats.org/drawingml/2006/picture">
             <wp:extent cx="5400000" cy="2011336"/>
-            <wp:docPr id="9" name="Picture 9"/>
+            <wp:docPr id="10" name="Picture 10"/>
             <wp:cNvGraphicFramePr>
               <a:graphicFrameLocks noChangeAspect="1"/>
             </wp:cNvGraphicFramePr>
@@ -1847,7 +2423,7 @@
                     <pic:cNvPicPr/>
                   </pic:nvPicPr>
                   <pic:blipFill>
-                    <a:blip r:embed="rId18"/>
+                    <a:blip r:embed="rId19"/>
                     <a:stretch>
                       <a:fillRect/>
                     </a:stretch>
@@ -1875,9 +2451,10 @@
       <w:r>
         <w:rPr>
           <w:i w:val="0"/>
+          <w:color w:val="000000"/>
           <w:sz w:val="24"/>
         </w:rPr>
-        <w:t>Рисунок 9 – ufw status verbose: политики по умолчанию и правило LIMIT</w:t>
+        <w:t>Рисунок 9 — ufw status verbose: политики по умолчанию и правило LIMIT</w:t>
       </w:r>
     </w:p>
     <w:p>
@@ -1898,7 +2475,7 @@
       <w:r>
         <w:rPr>
           <w:rFonts w:ascii="Consolas" w:hAnsi="Consolas"/>
-          <w:color w:val="1A1A1A"/>
+          <w:color w:val="000000"/>
           <w:sz w:val="21"/>
         </w:rPr>
         <w:t>sudo ufw logging medium</w:t>
@@ -1913,7 +2490,7 @@
       <w:r>
         <w:rPr>
           <w:rFonts w:ascii="Consolas" w:hAnsi="Consolas"/>
-          <w:color w:val="1A1A1A"/>
+          <w:color w:val="000000"/>
           <w:sz w:val="21"/>
         </w:rPr>
         <w:t># с хоста: curl -m 3 http://192.168.56.101:8080</w:t>
@@ -1928,7 +2505,7 @@
       <w:r>
         <w:rPr>
           <w:rFonts w:ascii="Consolas" w:hAnsi="Consolas"/>
-          <w:color w:val="1A1A1A"/>
+          <w:color w:val="000000"/>
           <w:sz w:val="21"/>
         </w:rPr>
         <w:t>sudo grep 'UFW BLOCK' /var/log/ufw.log | tail -5</w:t>
@@ -1943,7 +2520,7 @@
         <w:drawing>
           <wp:inline xmlns:a="http://schemas.openxmlformats.org/drawingml/2006/main" xmlns:pic="http://schemas.openxmlformats.org/drawingml/2006/picture">
             <wp:extent cx="5400000" cy="936687"/>
-            <wp:docPr id="10" name="Picture 10"/>
+            <wp:docPr id="11" name="Picture 11"/>
             <wp:cNvGraphicFramePr>
               <a:graphicFrameLocks noChangeAspect="1"/>
             </wp:cNvGraphicFramePr>
@@ -1955,7 +2532,7 @@
                     <pic:cNvPicPr/>
                   </pic:nvPicPr>
                   <pic:blipFill>
-                    <a:blip r:embed="rId19"/>
+                    <a:blip r:embed="rId20"/>
                     <a:stretch>
                       <a:fillRect/>
                     </a:stretch>
@@ -1983,9 +2560,10 @@
       <w:r>
         <w:rPr>
           <w:i w:val="0"/>
+          <w:color w:val="000000"/>
           <w:sz w:val="24"/>
         </w:rPr>
-        <w:t>Рисунок 10 – запись UFW BLOCK и разбор её полей</w:t>
+        <w:t>Рисунок 10 — запись UFW BLOCK и разбор её полей</w:t>
       </w:r>
     </w:p>
     <w:p>
@@ -2023,7 +2601,7 @@
       <w:r>
         <w:rPr>
           <w:rFonts w:ascii="Consolas" w:hAnsi="Consolas"/>
-          <w:color w:val="1A1A1A"/>
+          <w:color w:val="000000"/>
           <w:sz w:val="21"/>
         </w:rPr>
         <w:t>192.168.56.101 devops.local</w:t>
@@ -2038,7 +2616,7 @@
       <w:r>
         <w:rPr>
           <w:rFonts w:ascii="Consolas" w:hAnsi="Consolas"/>
-          <w:color w:val="1A1A1A"/>
+          <w:color w:val="000000"/>
           <w:sz w:val="21"/>
         </w:rPr>
         <w:t>ping devops.local</w:t>
@@ -2053,7 +2631,7 @@
       <w:r>
         <w:rPr>
           <w:rFonts w:ascii="Consolas" w:hAnsi="Consolas"/>
-          <w:color w:val="1A1A1A"/>
+          <w:color w:val="000000"/>
           <w:sz w:val="21"/>
         </w:rPr>
         <w:t>ssh -p 2222 devops@devops.local</w:t>
@@ -2068,7 +2646,7 @@
         <w:drawing>
           <wp:inline xmlns:a="http://schemas.openxmlformats.org/drawingml/2006/main" xmlns:pic="http://schemas.openxmlformats.org/drawingml/2006/picture">
             <wp:extent cx="5400000" cy="1536000"/>
-            <wp:docPr id="11" name="Picture 11"/>
+            <wp:docPr id="12" name="Picture 12"/>
             <wp:cNvGraphicFramePr>
               <a:graphicFrameLocks noChangeAspect="1"/>
             </wp:cNvGraphicFramePr>
@@ -2080,7 +2658,7 @@
                     <pic:cNvPicPr/>
                   </pic:nvPicPr>
                   <pic:blipFill>
-                    <a:blip r:embed="rId20"/>
+                    <a:blip r:embed="rId21"/>
                     <a:stretch>
                       <a:fillRect/>
                     </a:stretch>
@@ -2108,9 +2686,10 @@
       <w:r>
         <w:rPr>
           <w:i w:val="0"/>
+          <w:color w:val="000000"/>
           <w:sz w:val="24"/>
         </w:rPr>
-        <w:t>Рисунок 11 – подключение по имени devops.local</w:t>
+        <w:t>Рисунок 11 — подключение по имени devops.local</w:t>
       </w:r>
     </w:p>
     <w:p>
@@ -2131,7 +2710,7 @@
       <w:r>
         <w:rPr>
           <w:rFonts w:ascii="Consolas" w:hAnsi="Consolas"/>
-          <w:color w:val="1A1A1A"/>
+          <w:color w:val="000000"/>
           <w:sz w:val="21"/>
         </w:rPr>
         <w:t>sudo hostnamectl set-hostname devops-vm</w:t>
@@ -2146,7 +2725,7 @@
       <w:r>
         <w:rPr>
           <w:rFonts w:ascii="Consolas" w:hAnsi="Consolas"/>
-          <w:color w:val="1A1A1A"/>
+          <w:color w:val="000000"/>
           <w:sz w:val="21"/>
         </w:rPr>
         <w:t>sudo sed -i 's/^127.0.1.1.*/127.0.1.1 devops-vm.devops.local devops-vm/' /etc/hosts</w:t>
@@ -2161,7 +2740,7 @@
       <w:r>
         <w:rPr>
           <w:rFonts w:ascii="Consolas" w:hAnsi="Consolas"/>
-          <w:color w:val="1A1A1A"/>
+          <w:color w:val="000000"/>
           <w:sz w:val="21"/>
         </w:rPr>
         <w:t>hostname -f</w:t>
@@ -2176,7 +2755,7 @@
         <w:drawing>
           <wp:inline xmlns:a="http://schemas.openxmlformats.org/drawingml/2006/main" xmlns:pic="http://schemas.openxmlformats.org/drawingml/2006/picture">
             <wp:extent cx="5400000" cy="2880000"/>
-            <wp:docPr id="12" name="Picture 12"/>
+            <wp:docPr id="13" name="Picture 13"/>
             <wp:cNvGraphicFramePr>
               <a:graphicFrameLocks noChangeAspect="1"/>
             </wp:cNvGraphicFramePr>
@@ -2188,7 +2767,7 @@
                     <pic:cNvPicPr/>
                   </pic:nvPicPr>
                   <pic:blipFill>
-                    <a:blip r:embed="rId21"/>
+                    <a:blip r:embed="rId22"/>
                     <a:stretch>
                       <a:fillRect/>
                     </a:stretch>
@@ -2216,9 +2795,10 @@
       <w:r>
         <w:rPr>
           <w:i w:val="0"/>
+          <w:color w:val="000000"/>
           <w:sz w:val="24"/>
         </w:rPr>
-        <w:t>Рисунок 12 – вывод hostname -f и успешный прогон audit.sh</w:t>
+        <w:t>Рисунок 12 — вывод hostname -f и успешный прогон audit.sh</w:t>
       </w:r>
     </w:p>
     <w:p>
@@ -2256,7 +2836,7 @@
       <w:r>
         <w:rPr>
           <w:rFonts w:ascii="Consolas" w:hAnsi="Consolas"/>
-          <w:color w:val="1A1A1A"/>
+          <w:color w:val="000000"/>
           <w:sz w:val="21"/>
         </w:rPr>
         <w:t>mkdir -p ~/restricted &amp;&amp; cd ~/restricted</w:t>
@@ -2271,7 +2851,7 @@
       <w:r>
         <w:rPr>
           <w:rFonts w:ascii="Consolas" w:hAnsi="Consolas"/>
-          <w:color w:val="1A1A1A"/>
+          <w:color w:val="000000"/>
           <w:sz w:val="21"/>
         </w:rPr>
         <w:t>echo "&lt;h1&gt;Ресурс доступен только через туннель&lt;/h1&gt;" &gt; index.html</w:t>
@@ -2286,7 +2866,7 @@
       <w:r>
         <w:rPr>
           <w:rFonts w:ascii="Consolas" w:hAnsi="Consolas"/>
-          <w:color w:val="1A1A1A"/>
+          <w:color w:val="000000"/>
           <w:sz w:val="21"/>
         </w:rPr>
         <w:t>python3 -m http.server 8080 --bind 127.0.0.1</w:t>
@@ -2310,7 +2890,7 @@
       <w:r>
         <w:rPr>
           <w:rFonts w:ascii="Consolas" w:hAnsi="Consolas"/>
-          <w:color w:val="1A1A1A"/>
+          <w:color w:val="000000"/>
           <w:sz w:val="21"/>
         </w:rPr>
         <w:t>ssh -L 9090:127.0.0.1:8080 -N devops</w:t>
@@ -2325,7 +2905,7 @@
         <w:drawing>
           <wp:inline xmlns:a="http://schemas.openxmlformats.org/drawingml/2006/main" xmlns:pic="http://schemas.openxmlformats.org/drawingml/2006/picture">
             <wp:extent cx="5400000" cy="1353967"/>
-            <wp:docPr id="13" name="Picture 13"/>
+            <wp:docPr id="14" name="Picture 14"/>
             <wp:cNvGraphicFramePr>
               <a:graphicFrameLocks noChangeAspect="1"/>
             </wp:cNvGraphicFramePr>
@@ -2337,7 +2917,7 @@
                     <pic:cNvPicPr/>
                   </pic:nvPicPr>
                   <pic:blipFill>
-                    <a:blip r:embed="rId22"/>
+                    <a:blip r:embed="rId23"/>
                     <a:stretch>
                       <a:fillRect/>
                     </a:stretch>
@@ -2365,9 +2945,10 @@
       <w:r>
         <w:rPr>
           <w:i w:val="0"/>
+          <w:color w:val="000000"/>
           <w:sz w:val="24"/>
         </w:rPr>
-        <w:t>Рисунок 13 – недоступность службы извне и доступ через localhost:9090</w:t>
+        <w:t>Рисунок 13 — недоступность службы извне и доступ через localhost:9090</w:t>
       </w:r>
     </w:p>
     <w:p>
@@ -2448,7 +3029,7 @@
         <w:drawing>
           <wp:inline xmlns:a="http://schemas.openxmlformats.org/drawingml/2006/main" xmlns:pic="http://schemas.openxmlformats.org/drawingml/2006/picture">
             <wp:extent cx="5400000" cy="2040000"/>
-            <wp:docPr id="14" name="Picture 14"/>
+            <wp:docPr id="15" name="Picture 15"/>
             <wp:cNvGraphicFramePr>
               <a:graphicFrameLocks noChangeAspect="1"/>
             </wp:cNvGraphicFramePr>
@@ -2460,7 +3041,7 @@
                     <pic:cNvPicPr/>
                   </pic:nvPicPr>
                   <pic:blipFill>
-                    <a:blip r:embed="rId23"/>
+                    <a:blip r:embed="rId24"/>
                     <a:stretch>
                       <a:fillRect/>
                     </a:stretch>
@@ -2488,9 +3069,10 @@
       <w:r>
         <w:rPr>
           <w:i w:val="0"/>
+          <w:color w:val="000000"/>
           <w:sz w:val="24"/>
         </w:rPr>
-        <w:t>Рисунок 14 – прогон аудита на намеренно нарушенной конфигурации (exit 1)</w:t>
+        <w:t>Рисунок 14 — прогон аудита на намеренно нарушенной конфигурации (exit 1)</w:t>
       </w:r>
     </w:p>
     <w:p>
@@ -2782,7 +3364,7 @@
         <w:rPr>
           <w:sz w:val="24"/>
         </w:rPr>
-        <w:t>Таблица 2 – Контроль выполнения условий перед сдачей отчёта</w:t>
+        <w:t>Таблица 2 — Контроль выполнения условий перед сдачей отчёта</w:t>
       </w:r>
     </w:p>
     <w:tbl>
@@ -2790,18 +3372,18 @@
         <w:tblStyle w:val="TableGrid"/>
         <w:tblW w:type="auto" w:w="0"/>
         <w:jc w:val="center"/>
-        <w:tblLayout w:type="autofit"/>
+        <w:tblLayout w:type="fixed"/>
         <w:tblLook w:firstColumn="1" w:firstRow="1" w:lastColumn="0" w:lastRow="0" w:noHBand="0" w:noVBand="1" w:val="04A0"/>
       </w:tblPr>
       <w:tblGrid>
-        <w:gridCol w:w="3213"/>
-        <w:gridCol w:w="3213"/>
-        <w:gridCol w:w="3213"/>
+        <w:gridCol w:w="3118"/>
+        <w:gridCol w:w="3118"/>
+        <w:gridCol w:w="3118"/>
       </w:tblGrid>
       <w:tr>
         <w:tc>
           <w:tcPr>
-            <w:tcW w:type="dxa" w:w="3213"/>
+            <w:tcW w:type="dxa" w:w="850"/>
           </w:tcPr>
           <w:p>
             <w:pPr>
@@ -2813,6 +3395,7 @@
               <w:rPr>
                 <w:rFonts w:ascii="Times New Roman" w:hAnsi="Times New Roman"/>
                 <w:b/>
+                <w:color w:val="000000"/>
                 <w:sz w:val="24"/>
               </w:rPr>
               <w:t>№</w:t>
@@ -2821,7 +3404,7 @@
         </w:tc>
         <w:tc>
           <w:tcPr>
-            <w:tcW w:type="dxa" w:w="3213"/>
+            <w:tcW w:type="dxa" w:w="4252"/>
           </w:tcPr>
           <w:p>
             <w:pPr>
@@ -2833,6 +3416,7 @@
               <w:rPr>
                 <w:rFonts w:ascii="Times New Roman" w:hAnsi="Times New Roman"/>
                 <w:b/>
+                <w:color w:val="000000"/>
                 <w:sz w:val="24"/>
               </w:rPr>
               <w:t>Условие</w:t>
@@ -2841,7 +3425,7 @@
         </w:tc>
         <w:tc>
           <w:tcPr>
-            <w:tcW w:type="dxa" w:w="3213"/>
+            <w:tcW w:type="dxa" w:w="4252"/>
           </w:tcPr>
           <w:p>
             <w:pPr>
@@ -2853,6 +3437,7 @@
               <w:rPr>
                 <w:rFonts w:ascii="Times New Roman" w:hAnsi="Times New Roman"/>
                 <w:b/>
+                <w:color w:val="000000"/>
                 <w:sz w:val="24"/>
               </w:rPr>
               <w:t>Подтверждение</w:t>
@@ -2863,7 +3448,7 @@
       <w:tr>
         <w:tc>
           <w:tcPr>
-            <w:tcW w:type="dxa" w:w="3213"/>
+            <w:tcW w:type="dxa" w:w="850"/>
           </w:tcPr>
           <w:p>
             <w:pPr>
@@ -2874,6 +3459,7 @@
             <w:r>
               <w:rPr>
                 <w:rFonts w:ascii="Times New Roman" w:hAnsi="Times New Roman"/>
+                <w:color w:val="000000"/>
                 <w:sz w:val="24"/>
               </w:rPr>
               <w:t>1</w:t>
@@ -2882,7 +3468,7 @@
         </w:tc>
         <w:tc>
           <w:tcPr>
-            <w:tcW w:type="dxa" w:w="3213"/>
+            <w:tcW w:type="dxa" w:w="4252"/>
           </w:tcPr>
           <w:p>
             <w:pPr>
@@ -2893,6 +3479,7 @@
             <w:r>
               <w:rPr>
                 <w:rFonts w:ascii="Times New Roman" w:hAnsi="Times New Roman"/>
+                <w:color w:val="000000"/>
                 <w:sz w:val="24"/>
               </w:rPr>
               <w:t>Вход по ключу без пароля</w:t>
@@ -2901,7 +3488,7 @@
         </w:tc>
         <w:tc>
           <w:tcPr>
-            <w:tcW w:type="dxa" w:w="3213"/>
+            <w:tcW w:type="dxa" w:w="4252"/>
           </w:tcPr>
           <w:p>
             <w:pPr>
@@ -2912,6 +3499,7 @@
             <w:r>
               <w:rPr>
                 <w:rFonts w:ascii="Times New Roman" w:hAnsi="Times New Roman"/>
+                <w:color w:val="000000"/>
                 <w:sz w:val="24"/>
               </w:rPr>
               <w:t>ssh devops — без запроса пароля (рисунок 3)</w:t>
@@ -2922,7 +3510,7 @@
       <w:tr>
         <w:tc>
           <w:tcPr>
-            <w:tcW w:type="dxa" w:w="3213"/>
+            <w:tcW w:type="dxa" w:w="850"/>
           </w:tcPr>
           <w:p>
             <w:pPr>
@@ -2933,6 +3521,7 @@
             <w:r>
               <w:rPr>
                 <w:rFonts w:ascii="Times New Roman" w:hAnsi="Times New Roman"/>
+                <w:color w:val="000000"/>
                 <w:sz w:val="24"/>
               </w:rPr>
               <w:t>2</w:t>
@@ -2941,7 +3530,7 @@
         </w:tc>
         <w:tc>
           <w:tcPr>
-            <w:tcW w:type="dxa" w:w="3213"/>
+            <w:tcW w:type="dxa" w:w="4252"/>
           </w:tcPr>
           <w:p>
             <w:pPr>
@@ -2952,6 +3541,7 @@
             <w:r>
               <w:rPr>
                 <w:rFonts w:ascii="Times New Roman" w:hAnsi="Times New Roman"/>
+                <w:color w:val="000000"/>
                 <w:sz w:val="24"/>
               </w:rPr>
               <w:t>Вход root запрещён</w:t>
@@ -2960,7 +3550,7 @@
         </w:tc>
         <w:tc>
           <w:tcPr>
-            <w:tcW w:type="dxa" w:w="3213"/>
+            <w:tcW w:type="dxa" w:w="4252"/>
           </w:tcPr>
           <w:p>
             <w:pPr>
@@ -2971,6 +3561,7 @@
             <w:r>
               <w:rPr>
                 <w:rFonts w:ascii="Times New Roman" w:hAnsi="Times New Roman"/>
+                <w:color w:val="000000"/>
                 <w:sz w:val="24"/>
               </w:rPr>
               <w:t>sshd -T | grep permitrootlogin → no (рисунок 5)</w:t>
@@ -2981,7 +3572,7 @@
       <w:tr>
         <w:tc>
           <w:tcPr>
-            <w:tcW w:type="dxa" w:w="3213"/>
+            <w:tcW w:type="dxa" w:w="850"/>
           </w:tcPr>
           <w:p>
             <w:pPr>
@@ -2992,6 +3583,7 @@
             <w:r>
               <w:rPr>
                 <w:rFonts w:ascii="Times New Roman" w:hAnsi="Times New Roman"/>
+                <w:color w:val="000000"/>
                 <w:sz w:val="24"/>
               </w:rPr>
               <w:t>3</w:t>
@@ -3000,7 +3592,7 @@
         </w:tc>
         <w:tc>
           <w:tcPr>
-            <w:tcW w:type="dxa" w:w="3213"/>
+            <w:tcW w:type="dxa" w:w="4252"/>
           </w:tcPr>
           <w:p>
             <w:pPr>
@@ -3011,6 +3603,7 @@
             <w:r>
               <w:rPr>
                 <w:rFonts w:ascii="Times New Roman" w:hAnsi="Times New Roman"/>
+                <w:color w:val="000000"/>
                 <w:sz w:val="24"/>
               </w:rPr>
               <w:t>Парольная аутентификация отключена</w:t>
@@ -3019,7 +3612,7 @@
         </w:tc>
         <w:tc>
           <w:tcPr>
-            <w:tcW w:type="dxa" w:w="3213"/>
+            <w:tcW w:type="dxa" w:w="4252"/>
           </w:tcPr>
           <w:p>
             <w:pPr>
@@ -3030,6 +3623,7 @@
             <w:r>
               <w:rPr>
                 <w:rFonts w:ascii="Times New Roman" w:hAnsi="Times New Roman"/>
+                <w:color w:val="000000"/>
                 <w:sz w:val="24"/>
               </w:rPr>
               <w:t>sshd -T | grep passwordauth → no (рисунок 5)</w:t>
@@ -3040,7 +3634,7 @@
       <w:tr>
         <w:tc>
           <w:tcPr>
-            <w:tcW w:type="dxa" w:w="3213"/>
+            <w:tcW w:type="dxa" w:w="850"/>
           </w:tcPr>
           <w:p>
             <w:pPr>
@@ -3051,6 +3645,7 @@
             <w:r>
               <w:rPr>
                 <w:rFonts w:ascii="Times New Roman" w:hAnsi="Times New Roman"/>
+                <w:color w:val="000000"/>
                 <w:sz w:val="24"/>
               </w:rPr>
               <w:t>4</w:t>
@@ -3059,7 +3654,7 @@
         </w:tc>
         <w:tc>
           <w:tcPr>
-            <w:tcW w:type="dxa" w:w="3213"/>
+            <w:tcW w:type="dxa" w:w="4252"/>
           </w:tcPr>
           <w:p>
             <w:pPr>
@@ -3070,6 +3665,7 @@
             <w:r>
               <w:rPr>
                 <w:rFonts w:ascii="Times New Roman" w:hAnsi="Times New Roman"/>
+                <w:color w:val="000000"/>
                 <w:sz w:val="24"/>
               </w:rPr>
               <w:t>SSH на нестандартном порту</w:t>
@@ -3078,7 +3674,7 @@
         </w:tc>
         <w:tc>
           <w:tcPr>
-            <w:tcW w:type="dxa" w:w="3213"/>
+            <w:tcW w:type="dxa" w:w="4252"/>
           </w:tcPr>
           <w:p>
             <w:pPr>
@@ -3089,6 +3685,7 @@
             <w:r>
               <w:rPr>
                 <w:rFonts w:ascii="Times New Roman" w:hAnsi="Times New Roman"/>
+                <w:color w:val="000000"/>
                 <w:sz w:val="24"/>
               </w:rPr>
               <w:t>ss -tlnp | grep sshd → 0.0.0.0:2222 (рисунок 6)</w:t>
@@ -3099,7 +3696,7 @@
       <w:tr>
         <w:tc>
           <w:tcPr>
-            <w:tcW w:type="dxa" w:w="3213"/>
+            <w:tcW w:type="dxa" w:w="850"/>
           </w:tcPr>
           <w:p>
             <w:pPr>
@@ -3110,6 +3707,7 @@
             <w:r>
               <w:rPr>
                 <w:rFonts w:ascii="Times New Roman" w:hAnsi="Times New Roman"/>
+                <w:color w:val="000000"/>
                 <w:sz w:val="24"/>
               </w:rPr>
               <w:t>5</w:t>
@@ -3118,7 +3716,7 @@
         </w:tc>
         <w:tc>
           <w:tcPr>
-            <w:tcW w:type="dxa" w:w="3213"/>
+            <w:tcW w:type="dxa" w:w="4252"/>
           </w:tcPr>
           <w:p>
             <w:pPr>
@@ -3129,6 +3727,7 @@
             <w:r>
               <w:rPr>
                 <w:rFonts w:ascii="Times New Roman" w:hAnsi="Times New Roman"/>
+                <w:color w:val="000000"/>
                 <w:sz w:val="24"/>
               </w:rPr>
               <w:t>UFW активен, deny, LIMIT</w:t>
@@ -3137,7 +3736,7 @@
         </w:tc>
         <w:tc>
           <w:tcPr>
-            <w:tcW w:type="dxa" w:w="3213"/>
+            <w:tcW w:type="dxa" w:w="4252"/>
           </w:tcPr>
           <w:p>
             <w:pPr>
@@ -3148,6 +3747,7 @@
             <w:r>
               <w:rPr>
                 <w:rFonts w:ascii="Times New Roman" w:hAnsi="Times New Roman"/>
+                <w:color w:val="000000"/>
                 <w:sz w:val="24"/>
               </w:rPr>
               <w:t>ufw status verbose (рисунок 9)</w:t>
@@ -3158,7 +3758,7 @@
       <w:tr>
         <w:tc>
           <w:tcPr>
-            <w:tcW w:type="dxa" w:w="3213"/>
+            <w:tcW w:type="dxa" w:w="850"/>
           </w:tcPr>
           <w:p>
             <w:pPr>
@@ -3169,6 +3769,7 @@
             <w:r>
               <w:rPr>
                 <w:rFonts w:ascii="Times New Roman" w:hAnsi="Times New Roman"/>
+                <w:color w:val="000000"/>
                 <w:sz w:val="24"/>
               </w:rPr>
               <w:t>6</w:t>
@@ -3177,7 +3778,7 @@
         </w:tc>
         <w:tc>
           <w:tcPr>
-            <w:tcW w:type="dxa" w:w="3213"/>
+            <w:tcW w:type="dxa" w:w="4252"/>
           </w:tcPr>
           <w:p>
             <w:pPr>
@@ -3188,6 +3789,7 @@
             <w:r>
               <w:rPr>
                 <w:rFonts w:ascii="Times New Roman" w:hAnsi="Times New Roman"/>
+                <w:color w:val="000000"/>
                 <w:sz w:val="24"/>
               </w:rPr>
               <w:t>devops.local разрешается</w:t>
@@ -3196,7 +3798,7 @@
         </w:tc>
         <w:tc>
           <w:tcPr>
-            <w:tcW w:type="dxa" w:w="3213"/>
+            <w:tcW w:type="dxa" w:w="4252"/>
           </w:tcPr>
           <w:p>
             <w:pPr>
@@ -3207,6 +3809,7 @@
             <w:r>
               <w:rPr>
                 <w:rFonts w:ascii="Times New Roman" w:hAnsi="Times New Roman"/>
+                <w:color w:val="000000"/>
                 <w:sz w:val="24"/>
               </w:rPr>
               <w:t>ssh -p 2222 devops@devops.local (рисунок 11)</w:t>
@@ -3217,7 +3820,7 @@
       <w:tr>
         <w:tc>
           <w:tcPr>
-            <w:tcW w:type="dxa" w:w="3213"/>
+            <w:tcW w:type="dxa" w:w="850"/>
           </w:tcPr>
           <w:p>
             <w:pPr>
@@ -3228,6 +3831,7 @@
             <w:r>
               <w:rPr>
                 <w:rFonts w:ascii="Times New Roman" w:hAnsi="Times New Roman"/>
+                <w:color w:val="000000"/>
                 <w:sz w:val="24"/>
               </w:rPr>
               <w:t>7</w:t>
@@ -3236,7 +3840,7 @@
         </w:tc>
         <w:tc>
           <w:tcPr>
-            <w:tcW w:type="dxa" w:w="3213"/>
+            <w:tcW w:type="dxa" w:w="4252"/>
           </w:tcPr>
           <w:p>
             <w:pPr>
@@ -3247,6 +3851,7 @@
             <w:r>
               <w:rPr>
                 <w:rFonts w:ascii="Times New Roman" w:hAnsi="Times New Roman"/>
+                <w:color w:val="000000"/>
                 <w:sz w:val="24"/>
               </w:rPr>
               <w:t>Три снимка ВМ</w:t>
@@ -3255,7 +3860,7 @@
         </w:tc>
         <w:tc>
           <w:tcPr>
-            <w:tcW w:type="dxa" w:w="3213"/>
+            <w:tcW w:type="dxa" w:w="4252"/>
           </w:tcPr>
           <w:p>
             <w:pPr>
@@ -3266,6 +3871,7 @@
             <w:r>
               <w:rPr>
                 <w:rFonts w:ascii="Times New Roman" w:hAnsi="Times New Roman"/>
+                <w:color w:val="000000"/>
                 <w:sz w:val="24"/>
               </w:rPr>
               <w:t>менеджер снимков (рисунок 2)</w:t>
@@ -3276,7 +3882,7 @@
       <w:tr>
         <w:tc>
           <w:tcPr>
-            <w:tcW w:type="dxa" w:w="3213"/>
+            <w:tcW w:type="dxa" w:w="850"/>
           </w:tcPr>
           <w:p>
             <w:pPr>
@@ -3287,6 +3893,7 @@
             <w:r>
               <w:rPr>
                 <w:rFonts w:ascii="Times New Roman" w:hAnsi="Times New Roman"/>
+                <w:color w:val="000000"/>
                 <w:sz w:val="24"/>
               </w:rPr>
               <w:t>8</w:t>
@@ -3295,7 +3902,7 @@
         </w:tc>
         <w:tc>
           <w:tcPr>
-            <w:tcW w:type="dxa" w:w="3213"/>
+            <w:tcW w:type="dxa" w:w="4252"/>
           </w:tcPr>
           <w:p>
             <w:pPr>
@@ -3306,6 +3913,7 @@
             <w:r>
               <w:rPr>
                 <w:rFonts w:ascii="Times New Roman" w:hAnsi="Times New Roman"/>
+                <w:color w:val="000000"/>
                 <w:sz w:val="24"/>
               </w:rPr>
               <w:t>Скрипт и документация в репозитории</w:t>
@@ -3314,7 +3922,7 @@
         </w:tc>
         <w:tc>
           <w:tcPr>
-            <w:tcW w:type="dxa" w:w="3213"/>
+            <w:tcW w:type="dxa" w:w="4252"/>
           </w:tcPr>
           <w:p>
             <w:pPr>
@@ -3325,6 +3933,7 @@
             <w:r>
               <w:rPr>
                 <w:rFonts w:ascii="Times New Roman" w:hAnsi="Times New Roman"/>
+                <w:color w:val="000000"/>
                 <w:sz w:val="24"/>
               </w:rPr>
               <w:t>scripts/audit.sh, docs/server-setup.md (приложение А)</w:t>
@@ -3518,7 +4127,7 @@
       <w:r>
         <w:rPr>
           <w:rFonts w:ascii="Consolas" w:hAnsi="Consolas"/>
-          <w:color w:val="1A1A1A"/>
+          <w:color w:val="000000"/>
           <w:sz w:val="21"/>
         </w:rPr>
         <w:t>git log --oneline</w:t>
@@ -3533,7 +4142,7 @@
       <w:r>
         <w:rPr>
           <w:rFonts w:ascii="Consolas" w:hAnsi="Consolas"/>
-          <w:color w:val="1A1A1A"/>
+          <w:color w:val="000000"/>
           <w:sz w:val="21"/>
         </w:rPr>
         <w:t>feat: add PR5 SSH hardening audit script and server docs</w:t>
@@ -3542,8 +4151,9 @@
     <w:sectPr>
       <w:footerReference w:type="default" r:id="rId9"/>
       <w:pgSz w:w="11906" w:h="16838"/>
-      <w:pgMar w:top="1134" w:right="567" w:bottom="1134" w:left="1701" w:header="567" w:footer="709" w:gutter="0"/>
+      <w:pgMar w:top="1134" w:right="850" w:bottom="1134" w:left="1701" w:header="567" w:footer="709" w:gutter="0"/>
       <w:cols w:space="720"/>
+      <w:titlePg/>
       <w:docGrid w:linePitch="360"/>
     </w:sectPr>
   </w:body>

</xml_diff>

<commit_message>
fix: fixed table layout and gridCol widths for LibreOffice render
</commit_message>
<xml_diff>
--- a/report/PR5_SSH_UFW_DNS_Report.docx
+++ b/report/PR5_SSH_UFW_DNS_Report.docx
@@ -688,10 +688,11 @@
         <w:jc w:val="center"/>
         <w:tblLayout w:type="fixed"/>
         <w:tblLook w:firstColumn="1" w:firstRow="1" w:lastColumn="0" w:lastRow="0" w:noHBand="0" w:noVBand="1" w:val="04A0"/>
+        <w:tblLayout w:type="fixed"/>
       </w:tblPr>
       <w:tblGrid>
-        <w:gridCol w:w="4677"/>
-        <w:gridCol w:w="4677"/>
+        <w:gridCol w:w="3118"/>
+        <w:gridCol w:w="6237"/>
       </w:tblGrid>
       <w:tr>
         <w:tc>
@@ -3374,11 +3375,12 @@
         <w:jc w:val="center"/>
         <w:tblLayout w:type="fixed"/>
         <w:tblLook w:firstColumn="1" w:firstRow="1" w:lastColumn="0" w:lastRow="0" w:noHBand="0" w:noVBand="1" w:val="04A0"/>
+        <w:tblLayout w:type="fixed"/>
       </w:tblPr>
       <w:tblGrid>
-        <w:gridCol w:w="3118"/>
-        <w:gridCol w:w="3118"/>
-        <w:gridCol w:w="3118"/>
+        <w:gridCol w:w="850"/>
+        <w:gridCol w:w="4252"/>
+        <w:gridCol w:w="4252"/>
       </w:tblGrid>
       <w:tr>
         <w:tc>

</xml_diff>